<commit_message>
chore(demo): recaptura fixtures F1 scorecard (IBK-04)
</commit_message>
<xml_diff>
--- a/web/src/fixtures/demo/report-f1.docx
+++ b/web/src/fixtures/demo/report-f1.docx
@@ -183,7 +183,7 @@
         <w:rPr>
           <w:rFonts w:ascii="Consolas" w:hAnsi="Consolas"/>
         </w:rPr>
-        <w:t>config_hash=493fd2a02e28ee27ce591d4ee3a16e3adaf6d7ca888b2d12d9e2fb211338b2e2</w:t>
+        <w:t>config_hash=fc3cf30dcd768f21960e603be4ca1524c2cf0105dd9b7fb67cb85bf373944a66</w:t>
       </w:r>
     </w:p>
     <w:p>
@@ -199,7 +199,7 @@
         <w:rPr>
           <w:rFonts w:ascii="Consolas" w:hAnsi="Consolas"/>
         </w:rPr>
-        <w:t>git_sha=fe4dfc78a6d7d6b3367ef49bcd66d94553faf5dd</w:t>
+        <w:t>git_sha=a341fd1c9644c56a194bbc869d49e7c86946f004</w:t>
       </w:r>
     </w:p>
     <w:p>
@@ -28994,11 +28994,6 @@
     </w:p>
     <w:p>
       <w:r>
-        <w:t>Caveats de reproducibilidad declarados por la corrida: working tree git sucio: cambios sin commitear no reconstruibles.</w:t>
-      </w:r>
-    </w:p>
-    <w:p>
-      <w:r>
         <w:t>No hay secciones obligatorias ausentes en esta corrida.</w:t>
       </w:r>
     </w:p>
@@ -29036,7 +29031,7 @@
         <w:rPr>
           <w:rFonts w:ascii="Consolas" w:hAnsi="Consolas"/>
         </w:rPr>
-        <w:t>493fd2a02e28ee27ce591d4ee3a16e3adaf6d7ca888b2d12d9e2fb211338b2e2</w:t>
+        <w:t>fc3cf30dcd768f21960e603be4ca1524c2cf0105dd9b7fb67cb85bf373944a66</w:t>
       </w:r>
     </w:p>
     <w:p>
@@ -29052,7 +29047,7 @@
         <w:rPr>
           <w:rFonts w:ascii="Consolas" w:hAnsi="Consolas"/>
         </w:rPr>
-        <w:t>2026-07-17T19:14:46.920865Z</w:t>
+        <w:t>2026-07-17T21:33:22.983198Z</w:t>
       </w:r>
     </w:p>
     <w:p>
@@ -29084,11 +29079,7 @@
         <w:rPr>
           <w:rFonts w:ascii="Consolas" w:hAnsi="Consolas"/>
         </w:rPr>
-        <w:t>[</w:t>
-        <w:br/>
-        <w:t xml:space="preserve">  "working tree git sucio: cambios sin commitear no reconstruibles"</w:t>
-        <w:br/>
-        <w:t>]</w:t>
+        <w:t>[]</w:t>
       </w:r>
     </w:p>
     <w:p>
@@ -29104,7 +29095,7 @@
         <w:rPr>
           <w:rFonts w:ascii="Consolas" w:hAnsi="Consolas"/>
         </w:rPr>
-        <w:t>true</w:t>
+        <w:t>false</w:t>
       </w:r>
     </w:p>
     <w:p>
@@ -29120,7 +29111,7 @@
         <w:rPr>
           <w:rFonts w:ascii="Consolas" w:hAnsi="Consolas"/>
         </w:rPr>
-        <w:t>fe4dfc78a6d7d6b3367ef49bcd66d94553faf5dd</w:t>
+        <w:t>a341fd1c9644c56a194bbc869d49e7c86946f004</w:t>
       </w:r>
     </w:p>
     <w:p>

</xml_diff>

<commit_message>
chore(demo): recaptura fixtures F1 scorecard (IBK-05, lineage 1.3.0)
</commit_message>
<xml_diff>
--- a/web/src/fixtures/demo/report-f1.docx
+++ b/web/src/fixtures/demo/report-f1.docx
@@ -163,7 +163,7 @@
           </w:tcPr>
           <w:p>
             <w:r>
-              <w:t>2026-07-17</w:t>
+              <w:t>2026-07-18</w:t>
             </w:r>
           </w:p>
         </w:tc>
@@ -183,7 +183,7 @@
         <w:rPr>
           <w:rFonts w:ascii="Consolas" w:hAnsi="Consolas"/>
         </w:rPr>
-        <w:t>config_hash=fc3cf30dcd768f21960e603be4ca1524c2cf0105dd9b7fb67cb85bf373944a66</w:t>
+        <w:t>config_hash=9587fef0641ab51e46f6aac726c21fd5be0a9f28ef22a262d3e662a335a16f05</w:t>
       </w:r>
     </w:p>
     <w:p>
@@ -199,7 +199,7 @@
         <w:rPr>
           <w:rFonts w:ascii="Consolas" w:hAnsi="Consolas"/>
         </w:rPr>
-        <w:t>git_sha=a341fd1c9644c56a194bbc869d49e7c86946f004</w:t>
+        <w:t>git_sha=d885cf743d0cead8cfa1f74111642f1616a3c407</w:t>
       </w:r>
     </w:p>
     <w:p>
@@ -29031,7 +29031,7 @@
         <w:rPr>
           <w:rFonts w:ascii="Consolas" w:hAnsi="Consolas"/>
         </w:rPr>
-        <w:t>fc3cf30dcd768f21960e603be4ca1524c2cf0105dd9b7fb67cb85bf373944a66</w:t>
+        <w:t>9587fef0641ab51e46f6aac726c21fd5be0a9f28ef22a262d3e662a335a16f05</w:t>
       </w:r>
     </w:p>
     <w:p>
@@ -29047,7 +29047,7 @@
         <w:rPr>
           <w:rFonts w:ascii="Consolas" w:hAnsi="Consolas"/>
         </w:rPr>
-        <w:t>2026-07-17T21:33:22.983198Z</w:t>
+        <w:t>2026-07-18T01:12:13.721740Z</w:t>
       </w:r>
     </w:p>
     <w:p>
@@ -29111,7 +29111,7 @@
         <w:rPr>
           <w:rFonts w:ascii="Consolas" w:hAnsi="Consolas"/>
         </w:rPr>
-        <w:t>a341fd1c9644c56a194bbc869d49e7c86946f004</w:t>
+        <w:t>d885cf743d0cead8cfa1f74111642f1616a3c407</w:t>
       </w:r>
     </w:p>
     <w:p>
@@ -29131,7 +29131,7 @@
         <w:br/>
         <w:t xml:space="preserve">  "PyYAML": "6.0.3",</w:t>
         <w:br/>
-        <w:t xml:space="preserve">  "nikodym": "1.2.0",</w:t>
+        <w:t xml:space="preserve">  "nikodym": "1.3.0",</w:t>
         <w:br/>
         <w:t xml:space="preserve">  "numpy": "2.4.6",</w:t>
         <w:br/>

</xml_diff>

<commit_message>
chore(demo): recaptura fixtures F1 scorecard (re-skin Quarto)
</commit_message>
<xml_diff>
--- a/web/src/fixtures/demo/report-f1.docx
+++ b/web/src/fixtures/demo/report-f1.docx
@@ -183,7 +183,7 @@
         <w:rPr>
           <w:rFonts w:ascii="Consolas" w:hAnsi="Consolas"/>
         </w:rPr>
-        <w:t>config_hash=9587fef0641ab51e46f6aac726c21fd5be0a9f28ef22a262d3e662a335a16f05</w:t>
+        <w:t>config_hash=e3b957d9fdc27904cc21cf4f8d27e5bca7f998d4d1253f640b6b951ced57c03b</w:t>
       </w:r>
     </w:p>
     <w:p>
@@ -199,7 +199,7 @@
         <w:rPr>
           <w:rFonts w:ascii="Consolas" w:hAnsi="Consolas"/>
         </w:rPr>
-        <w:t>git_sha=d885cf743d0cead8cfa1f74111642f1616a3c407</w:t>
+        <w:t>git_sha=d53ca4588fe1a6f95f396d2ec68d621a818b282d</w:t>
       </w:r>
     </w:p>
     <w:p>
@@ -29031,7 +29031,7 @@
         <w:rPr>
           <w:rFonts w:ascii="Consolas" w:hAnsi="Consolas"/>
         </w:rPr>
-        <w:t>9587fef0641ab51e46f6aac726c21fd5be0a9f28ef22a262d3e662a335a16f05</w:t>
+        <w:t>e3b957d9fdc27904cc21cf4f8d27e5bca7f998d4d1253f640b6b951ced57c03b</w:t>
       </w:r>
     </w:p>
     <w:p>
@@ -29047,7 +29047,7 @@
         <w:rPr>
           <w:rFonts w:ascii="Consolas" w:hAnsi="Consolas"/>
         </w:rPr>
-        <w:t>2026-07-18T01:12:13.721740Z</w:t>
+        <w:t>2026-07-18T14:41:29.491661Z</w:t>
       </w:r>
     </w:p>
     <w:p>
@@ -29111,7 +29111,7 @@
         <w:rPr>
           <w:rFonts w:ascii="Consolas" w:hAnsi="Consolas"/>
         </w:rPr>
-        <w:t>d885cf743d0cead8cfa1f74111642f1616a3c407</w:t>
+        <w:t>d53ca4588fe1a6f95f396d2ec68d621a818b282d</w:t>
       </w:r>
     </w:p>
     <w:p>
@@ -29131,7 +29131,7 @@
         <w:br/>
         <w:t xml:space="preserve">  "PyYAML": "6.0.3",</w:t>
         <w:br/>
-        <w:t xml:space="preserve">  "nikodym": "1.3.0",</w:t>
+        <w:t xml:space="preserve">  "nikodym": "1.2.0",</w:t>
         <w:br/>
         <w:t xml:space="preserve">  "numpy": "2.4.6",</w:t>
         <w:br/>

</xml_diff>

<commit_message>
chore(demo): recapturar F1 sin ruta del host en el config efectivo
Recaptura del bundle F1 con el workdir canónico (.nikodym-demo-fixtures-f1): el
'config efectivo' del informe (Anexo A, data.load.source) pasa de una ruta temporal
del host (/private/var/folders/.../T/tmp.../datasets/consumo_comportamiento.parquet)
al identificador POSIX portable .nikodym-demo-fixtures-f1/datasets/consumo_comportamiento.parquet
en HTML, PDF, DOCX y el zip. Números de negocio idénticos: results-f1.json solo
cambia run_id; el informe solo cambia created_at/config_hash/git_sha/ruta. Insignia
intacta (n_variables 5 · AUC dev 0.712346 · holdout 0.694646 · oot 0.656096 · target_pd 0.2).
</commit_message>
<xml_diff>
--- a/web/src/fixtures/demo/report-f1.docx
+++ b/web/src/fixtures/demo/report-f1.docx
@@ -163,7 +163,7 @@
           </w:tcPr>
           <w:p>
             <w:r>
-              <w:t>2026-07-18</w:t>
+              <w:t>2026-07-20</w:t>
             </w:r>
           </w:p>
         </w:tc>
@@ -183,7 +183,7 @@
         <w:rPr>
           <w:rFonts w:ascii="Consolas" w:hAnsi="Consolas"/>
         </w:rPr>
-        <w:t>config_hash=f7f310b8b8c980e9047a49dc752bcffdf69d3237c1ca921b4be21c800a726c31</w:t>
+        <w:t>config_hash=fc5021258eedde27bdbe0815d94a81eca5dd13ad405ba85d55d0cb6bb029edfc</w:t>
       </w:r>
     </w:p>
     <w:p>
@@ -199,7 +199,7 @@
         <w:rPr>
           <w:rFonts w:ascii="Consolas" w:hAnsi="Consolas"/>
         </w:rPr>
-        <w:t>git_sha=5fb189e2302629889fcd3d240e8f59c2239423f4</w:t>
+        <w:t>git_sha=b74785875a9e62db1c71e1927fabdac49fb98753</w:t>
       </w:r>
     </w:p>
     <w:p>
@@ -32799,7 +32799,7 @@
         <w:rPr>
           <w:rFonts w:ascii="Consolas" w:hAnsi="Consolas"/>
         </w:rPr>
-        <w:t>f7f310b8b8c980e9047a49dc752bcffdf69d3237c1ca921b4be21c800a726c31</w:t>
+        <w:t>fc5021258eedde27bdbe0815d94a81eca5dd13ad405ba85d55d0cb6bb029edfc</w:t>
       </w:r>
     </w:p>
     <w:p>
@@ -32815,7 +32815,7 @@
         <w:rPr>
           <w:rFonts w:ascii="Consolas" w:hAnsi="Consolas"/>
         </w:rPr>
-        <w:t>2026-07-18T17:30:20.398002Z</w:t>
+        <w:t>2026-07-20T18:30:36.644901Z</w:t>
       </w:r>
     </w:p>
     <w:p>
@@ -32879,7 +32879,7 @@
         <w:rPr>
           <w:rFonts w:ascii="Consolas" w:hAnsi="Consolas"/>
         </w:rPr>
-        <w:t>5fb189e2302629889fcd3d240e8f59c2239423f4</w:t>
+        <w:t>b74785875a9e62db1c71e1927fabdac49fb98753</w:t>
       </w:r>
     </w:p>
     <w:p>
@@ -39154,7 +39154,7 @@
         <w:br/>
         <w:t xml:space="preserve">    "file_format": "auto",</w:t>
         <w:br/>
-        <w:t xml:space="preserve">    "source": "/private/var/folders/12/yxnq95f55hg06fyynglz1scw0000gn/T/tmp02s6iq_q/datasets/consumo_comportamiento.parquet"</w:t>
+        <w:t xml:space="preserve">    "source": ".nikodym-demo-fixtures-f1/datasets/consumo_comportamiento.parquet"</w:t>
         <w:br/>
         <w:t xml:space="preserve">  },</w:t>
         <w:br/>

</xml_diff>

<commit_message>
chore(demo): recapturar el bundle F1 (scorecard) desde corrida real 1.4.0
Verificado sobre el artefacto: lineage 1.4.0, 0 celdas `nan`/`none`,
0 rutas del host y `config_hash` app ≡ informe
(4b93809d…). Métricas intactas: AUC desarrollo 0,7123 · Gini 0,4247 ·
KS 0,3201, con desarrollo > holdout > oot.

`toyaml-f1.json` pierde la clave `provisioning_internal: null`: es el
efecto buscado de `exclude_unset=True` (el preset F1 no la fija; el
campo sigue en el schema y su default es el mismo None).
</commit_message>
<xml_diff>
--- a/web/src/fixtures/demo/report-f1.docx
+++ b/web/src/fixtures/demo/report-f1.docx
@@ -163,7 +163,7 @@
           </w:tcPr>
           <w:p>
             <w:r>
-              <w:t>2026-07-20</w:t>
+              <w:t>2026-07-21</w:t>
             </w:r>
           </w:p>
         </w:tc>
@@ -183,7 +183,7 @@
         <w:rPr>
           <w:rFonts w:ascii="Consolas" w:hAnsi="Consolas"/>
         </w:rPr>
-        <w:t>config_hash=fc5021258eedde27bdbe0815d94a81eca5dd13ad405ba85d55d0cb6bb029edfc</w:t>
+        <w:t>config_hash=4b93809debd102cf1644f8b5acaa9abbd693204e9f3fb7346f392425677ae49f</w:t>
       </w:r>
     </w:p>
     <w:p>
@@ -199,7 +199,7 @@
         <w:rPr>
           <w:rFonts w:ascii="Consolas" w:hAnsi="Consolas"/>
         </w:rPr>
-        <w:t>git_sha=b74785875a9e62db1c71e1927fabdac49fb98753</w:t>
+        <w:t>git_sha=f6160ad258db1846d6d1dc73ab688a1f1ac10951</w:t>
       </w:r>
     </w:p>
     <w:p>
@@ -487,7 +487,7 @@
           </w:tcPr>
           <w:p>
             <w:r>
-              <w:t>0.7123</w:t>
+              <w:t>0,7123</w:t>
             </w:r>
           </w:p>
         </w:tc>
@@ -529,7 +529,7 @@
           </w:tcPr>
           <w:p>
             <w:r>
-              <w:t>0.4247</w:t>
+              <w:t>0,4247</w:t>
             </w:r>
           </w:p>
         </w:tc>
@@ -571,7 +571,7 @@
           </w:tcPr>
           <w:p>
             <w:r>
-              <w:t>0.3201</w:t>
+              <w:t>0,3201</w:t>
             </w:r>
           </w:p>
         </w:tc>
@@ -613,7 +613,7 @@
           </w:tcPr>
           <w:p>
             <w:r>
-              <w:t>0.6946</w:t>
+              <w:t>0,6946</w:t>
             </w:r>
           </w:p>
         </w:tc>
@@ -655,7 +655,7 @@
           </w:tcPr>
           <w:p>
             <w:r>
-              <w:t>0.3893</w:t>
+              <w:t>0,3893</w:t>
             </w:r>
           </w:p>
         </w:tc>
@@ -697,7 +697,7 @@
           </w:tcPr>
           <w:p>
             <w:r>
-              <w:t>0.3119</w:t>
+              <w:t>0,3119</w:t>
             </w:r>
           </w:p>
         </w:tc>
@@ -739,7 +739,7 @@
           </w:tcPr>
           <w:p>
             <w:r>
-              <w:t>0.6561</w:t>
+              <w:t>0,6561</w:t>
             </w:r>
           </w:p>
         </w:tc>
@@ -781,7 +781,7 @@
           </w:tcPr>
           <w:p>
             <w:r>
-              <w:t>0.3122</w:t>
+              <w:t>0,3122</w:t>
             </w:r>
           </w:p>
         </w:tc>
@@ -823,7 +823,7 @@
           </w:tcPr>
           <w:p>
             <w:r>
-              <w:t>0.2519</w:t>
+              <w:t>0,2519</w:t>
             </w:r>
           </w:p>
         </w:tc>
@@ -865,7 +865,7 @@
           </w:tcPr>
           <w:p>
             <w:r>
-              <w:t>0.0132</w:t>
+              <w:t>0,0132</w:t>
             </w:r>
           </w:p>
         </w:tc>
@@ -907,7 +907,7 @@
           </w:tcPr>
           <w:p>
             <w:r>
-              <w:t>0.0068</w:t>
+              <w:t>0,0068</w:t>
             </w:r>
           </w:p>
         </w:tc>
@@ -978,7 +978,7 @@
         <w:rPr>
           <w:i/>
         </w:rPr>
-        <w:t>Las bandas de PSI usan los umbrales configurados: estable por debajo de 0.10 y redesarrollo por sobre 0.25.</w:t>
+        <w:t>Las bandas de PSI usan los umbrales configurados: estable por debajo de 0,10 y redesarrollo por sobre 0,25.</w:t>
       </w:r>
     </w:p>
     <w:p>
@@ -1040,7 +1040,7 @@
     </w:p>
     <w:p>
       <w:r>
-        <w:t>La población procesada contiene 6.000 observaciones, 8 variables de entrada y una tasa de incumplimiento de 23.45 %. Los conteos por estado, partición y motivo de exclusión se reproducen literalmente en las tablas de esta sección.</w:t>
+        <w:t>La población procesada contiene 6.000 observaciones, 8 variables de entrada y una tasa de incumplimiento de 23,45 %. Los conteos por estado, partición y motivo de exclusión se reproducen literalmente en las tablas de esta sección.</w:t>
       </w:r>
     </w:p>
     <w:p>
@@ -1055,7 +1055,7 @@
     </w:p>
     <w:p>
       <w:r>
-        <w:t>La población se particionó por cohorte sobre «cohorte», reservando como OOT la cohorte «2024Q2», y un Holdout de 20.00 % del resto.</w:t>
+        <w:t>La población se particionó por cohorte sobre «cohorte», reservando como OOT la cohorte «2024Q2», y un Holdout de 20,00 % del resto.</w:t>
       </w:r>
     </w:p>
     <w:p>
@@ -1506,7 +1506,7 @@
     </w:p>
     <w:p>
       <w:r>
-        <w:t>En el tratamiento de faltantes se rechaza toda variable con más de 99.00 % de valores faltantes.</w:t>
+        <w:t>En el tratamiento de faltantes se rechaza toda variable con más de 99,00 % de valores faltantes.</w:t>
       </w:r>
     </w:p>
     <w:p>
@@ -1519,7 +1519,7 @@
     </w:p>
     <w:p>
       <w:r>
-        <w:t>Se discretizó cada variable con OptBinning, resolviendo el problema óptimo por programación entera mixta (MIP), partiendo de un máximo de 20 pre-bins, con un máximo de 6 bins por variable y un tamaño mínimo de bin de 5.00 % de la población.</w:t>
+        <w:t>Se discretizó cada variable con OptBinning, resolviendo el problema óptimo por programación entera mixta (MIP), partiendo de un máximo de 20 pre-bins, con un máximo de 6 bins por variable y un tamaño mínimo de bin de 5,00 % de la población.</w:t>
       </w:r>
     </w:p>
     <w:p>
@@ -1547,12 +1547,12 @@
     </w:p>
     <w:p>
       <w:r>
-        <w:t>Se descartaron las variables con IV inferior a 0.02; las de IV superior a 0.50 se marcaron para revisión, porque un poder predictivo tan alto suele indicar fuga de información más que señal legítima.</w:t>
+        <w:t>Se descartaron las variables con IV inferior a 0,02; las de IV superior a 0,50 se marcaron para revisión, porque un poder predictivo tan alto suele indicar fuga de información más que señal legítima.</w:t>
       </w:r>
     </w:p>
     <w:p>
       <w:r>
-        <w:t>Se eliminó la redundancia entre pares de variables con correlación (pearson) sobre 0.75 y se acotó la multicolinealidad exigiendo un VIF bajo 5.0.</w:t>
+        <w:t>Se eliminó la redundancia entre pares de variables con correlación (pearson) sobre 0,75 y se acotó la multicolinealidad exigiendo un VIF bajo 5,0.</w:t>
       </w:r>
     </w:p>
     <w:p>
@@ -1570,12 +1570,12 @@
     </w:p>
     <w:p>
       <w:r>
-        <w:t>La probabilidad de incumplimiento se modeló mediante regresión logística (logit) sobre las variables transformadas a WoE, con un nivel de significancia de 0.05.</w:t>
+        <w:t>La probabilidad de incumplimiento se modeló mediante regresión logística (logit) sobre las variables transformadas a WoE, con un nivel de significancia de 0,05.</w:t>
       </w:r>
     </w:p>
     <w:p>
       <w:r>
-        <w:t>La construcción del modelo usó stepwise bidireccional (criterio «wald_pvalue» y p-valor de entrada 0.05 y de salida 0.05).</w:t>
+        <w:t>La construcción del modelo usó stepwise bidireccional (criterio «wald_pvalue» y p-valor de entrada 0,05 y de salida 0,05).</w:t>
       </w:r>
     </w:p>
     <w:p>
@@ -1603,7 +1603,7 @@
     </w:p>
     <w:p>
       <w:r>
-        <w:t>De esa convención se derivan los parámetros efectivos de la escala: factor 28.8539 y offset 487.1229.</w:t>
+        <w:t>De esa convención se derivan los parámetros efectivos de la escala: factor 28,8539 y offset 487,1229.</w:t>
       </w:r>
     </w:p>
     <w:p>
@@ -1621,12 +1621,12 @@
     </w:p>
     <w:p>
       <w:r>
-        <w:t>La PD se calibró por desplazamiento del intercepto (intercept offset), ajustando sobre la partición de Desarrollo contra un ancla de negocio declarada explícitamente, con una PD objetivo de 20.00 %. El ancla es a través del ciclo (TTC).</w:t>
+        <w:t>La PD se calibró por desplazamiento del intercepto (intercept offset), ajustando sobre la partición de Desarrollo contra un ancla de negocio declarada explícitamente, con una PD objetivo de 20,00 %. El ancla es a través del ciclo (TTC).</w:t>
       </w:r>
     </w:p>
     <w:p>
       <w:r>
-        <w:t>El desplazamiento aplicado al intercepto es -0.2184, lo que preserva el ordenamiento del score: la calibración corrige el nivel de la PD, no su ranking.</w:t>
+        <w:t>El desplazamiento aplicado al intercepto es -0,2184, lo que preserva el ordenamiento del score: la calibración corrige el nivel de la PD, no su ranking.</w:t>
       </w:r>
     </w:p>
     <w:p>
@@ -1657,7 +1657,7 @@
     </w:p>
     <w:p>
       <w:r>
-        <w:t>El poder predictivo univariado (IV) de las 6 variables binificadas lo encabezan «ingreso_mensual» (0.305), «deuda_ingreso» (0.164) y «utilizacion_linea» (0.061). El IV de cada variable consta en la tabla siguiente y su binning completo, bin a bin, en el Anexo B.</w:t>
+        <w:t>El poder predictivo univariado (IV) de las 6 variables binificadas lo encabezan «ingreso_mensual» (0,305), «deuda_ingreso» (0,164) y «utilizacion_linea» (0,061). El IV de cada variable consta en la tabla siguiente y su binning completo, bin a bin, en el Anexo B.</w:t>
       </w:r>
     </w:p>
     <w:p>
@@ -2017,7 +2017,7 @@
           </w:tcPr>
           <w:p>
             <w:r>
-              <w:t>No disponible</w:t>
+              <w:t>—</w:t>
             </w:r>
           </w:p>
         </w:tc>
@@ -2159,7 +2159,7 @@
           </w:tcPr>
           <w:p>
             <w:r>
-              <w:t>No disponible</w:t>
+              <w:t>—</w:t>
             </w:r>
           </w:p>
         </w:tc>
@@ -2301,7 +2301,7 @@
           </w:tcPr>
           <w:p>
             <w:r>
-              <w:t>No disponible</w:t>
+              <w:t>—</w:t>
             </w:r>
           </w:p>
         </w:tc>
@@ -2443,7 +2443,7 @@
           </w:tcPr>
           <w:p>
             <w:r>
-              <w:t>No disponible</w:t>
+              <w:t>—</w:t>
             </w:r>
           </w:p>
         </w:tc>
@@ -2585,7 +2585,7 @@
           </w:tcPr>
           <w:p>
             <w:r>
-              <w:t>No disponible</w:t>
+              <w:t>—</w:t>
             </w:r>
           </w:p>
         </w:tc>
@@ -2687,7 +2687,7 @@
           </w:tcPr>
           <w:p>
             <w:r>
-              <w:t>none</w:t>
+              <w:t>—</w:t>
             </w:r>
           </w:p>
         </w:tc>
@@ -2717,7 +2717,7 @@
           </w:tcPr>
           <w:p>
             <w:r>
-              <w:t>No disponible</w:t>
+              <w:t>—</w:t>
             </w:r>
           </w:p>
         </w:tc>
@@ -2727,7 +2727,7 @@
           </w:tcPr>
           <w:p>
             <w:r>
-              <w:t>No disponible</w:t>
+              <w:t>—</w:t>
             </w:r>
           </w:p>
         </w:tc>
@@ -2753,7 +2753,7 @@
     </w:p>
     <w:p>
       <w:r>
-        <w:t>Tras la selección, la correlación absoluta máxima entre las variables finales es 0.0303 y el VIF máximo es 1.00.</w:t>
+        <w:t>Tras la selección, la correlación absoluta máxima entre las variables finales es 0,0303 y el VIF máximo es 1,00.</w:t>
       </w:r>
     </w:p>
     <w:p>
@@ -3082,7 +3082,7 @@
           </w:tcPr>
           <w:p>
             <w:r>
-              <w:t>No disponible</w:t>
+              <w:t>—</w:t>
             </w:r>
           </w:p>
         </w:tc>
@@ -3092,7 +3092,7 @@
           </w:tcPr>
           <w:p>
             <w:r>
-              <w:t>No disponible</w:t>
+              <w:t>—</w:t>
             </w:r>
           </w:p>
         </w:tc>
@@ -3112,7 +3112,7 @@
           </w:tcPr>
           <w:p>
             <w:r>
-              <w:t>No disponible</w:t>
+              <w:t>—</w:t>
             </w:r>
           </w:p>
         </w:tc>
@@ -3122,7 +3122,7 @@
           </w:tcPr>
           <w:p>
             <w:r>
-              <w:t>No disponible</w:t>
+              <w:t>—</w:t>
             </w:r>
           </w:p>
         </w:tc>
@@ -3132,7 +3132,7 @@
           </w:tcPr>
           <w:p>
             <w:r>
-              <w:t>No disponible</w:t>
+              <w:t>—</w:t>
             </w:r>
           </w:p>
         </w:tc>
@@ -3234,7 +3234,7 @@
           </w:tcPr>
           <w:p>
             <w:r>
-              <w:t>No disponible</w:t>
+              <w:t>—</w:t>
             </w:r>
           </w:p>
         </w:tc>
@@ -3244,7 +3244,7 @@
           </w:tcPr>
           <w:p>
             <w:r>
-              <w:t>No disponible</w:t>
+              <w:t>—</w:t>
             </w:r>
           </w:p>
         </w:tc>
@@ -3264,7 +3264,7 @@
           </w:tcPr>
           <w:p>
             <w:r>
-              <w:t>No disponible</w:t>
+              <w:t>—</w:t>
             </w:r>
           </w:p>
         </w:tc>
@@ -3274,7 +3274,7 @@
           </w:tcPr>
           <w:p>
             <w:r>
-              <w:t>No disponible</w:t>
+              <w:t>—</w:t>
             </w:r>
           </w:p>
         </w:tc>
@@ -3284,7 +3284,7 @@
           </w:tcPr>
           <w:p>
             <w:r>
-              <w:t>No disponible</w:t>
+              <w:t>—</w:t>
             </w:r>
           </w:p>
         </w:tc>
@@ -3386,7 +3386,7 @@
           </w:tcPr>
           <w:p>
             <w:r>
-              <w:t>No disponible</w:t>
+              <w:t>—</w:t>
             </w:r>
           </w:p>
         </w:tc>
@@ -3396,7 +3396,7 @@
           </w:tcPr>
           <w:p>
             <w:r>
-              <w:t>No disponible</w:t>
+              <w:t>—</w:t>
             </w:r>
           </w:p>
         </w:tc>
@@ -3416,7 +3416,7 @@
           </w:tcPr>
           <w:p>
             <w:r>
-              <w:t>No disponible</w:t>
+              <w:t>—</w:t>
             </w:r>
           </w:p>
         </w:tc>
@@ -3426,7 +3426,7 @@
           </w:tcPr>
           <w:p>
             <w:r>
-              <w:t>No disponible</w:t>
+              <w:t>—</w:t>
             </w:r>
           </w:p>
         </w:tc>
@@ -3436,7 +3436,7 @@
           </w:tcPr>
           <w:p>
             <w:r>
-              <w:t>No disponible</w:t>
+              <w:t>—</w:t>
             </w:r>
           </w:p>
         </w:tc>
@@ -3538,7 +3538,7 @@
           </w:tcPr>
           <w:p>
             <w:r>
-              <w:t>No disponible</w:t>
+              <w:t>—</w:t>
             </w:r>
           </w:p>
         </w:tc>
@@ -3548,7 +3548,7 @@
           </w:tcPr>
           <w:p>
             <w:r>
-              <w:t>No disponible</w:t>
+              <w:t>—</w:t>
             </w:r>
           </w:p>
         </w:tc>
@@ -3568,7 +3568,7 @@
           </w:tcPr>
           <w:p>
             <w:r>
-              <w:t>No disponible</w:t>
+              <w:t>—</w:t>
             </w:r>
           </w:p>
         </w:tc>
@@ -3578,7 +3578,7 @@
           </w:tcPr>
           <w:p>
             <w:r>
-              <w:t>No disponible</w:t>
+              <w:t>—</w:t>
             </w:r>
           </w:p>
         </w:tc>
@@ -3588,7 +3588,7 @@
           </w:tcPr>
           <w:p>
             <w:r>
-              <w:t>No disponible</w:t>
+              <w:t>—</w:t>
             </w:r>
           </w:p>
         </w:tc>
@@ -3650,7 +3650,7 @@
           </w:tcPr>
           <w:p>
             <w:r>
-              <w:t>none</w:t>
+              <w:t>—</w:t>
             </w:r>
           </w:p>
         </w:tc>
@@ -3690,7 +3690,7 @@
           </w:tcPr>
           <w:p>
             <w:r>
-              <w:t>No disponible</w:t>
+              <w:t>—</w:t>
             </w:r>
           </w:p>
         </w:tc>
@@ -3700,7 +3700,7 @@
           </w:tcPr>
           <w:p>
             <w:r>
-              <w:t>No disponible</w:t>
+              <w:t>—</w:t>
             </w:r>
           </w:p>
         </w:tc>
@@ -3710,7 +3710,7 @@
           </w:tcPr>
           <w:p>
             <w:r>
-              <w:t>nan</w:t>
+              <w:t>—</w:t>
             </w:r>
           </w:p>
         </w:tc>
@@ -3720,7 +3720,7 @@
           </w:tcPr>
           <w:p>
             <w:r>
-              <w:t>No disponible</w:t>
+              <w:t>—</w:t>
             </w:r>
           </w:p>
         </w:tc>
@@ -3730,7 +3730,7 @@
           </w:tcPr>
           <w:p>
             <w:r>
-              <w:t>No disponible</w:t>
+              <w:t>—</w:t>
             </w:r>
           </w:p>
         </w:tc>
@@ -3842,7 +3842,7 @@
           </w:tcPr>
           <w:p>
             <w:r>
-              <w:t>No disponible</w:t>
+              <w:t>—</w:t>
             </w:r>
           </w:p>
         </w:tc>
@@ -3852,7 +3852,7 @@
           </w:tcPr>
           <w:p>
             <w:r>
-              <w:t>No disponible</w:t>
+              <w:t>—</w:t>
             </w:r>
           </w:p>
         </w:tc>
@@ -3872,7 +3872,7 @@
           </w:tcPr>
           <w:p>
             <w:r>
-              <w:t>No disponible</w:t>
+              <w:t>—</w:t>
             </w:r>
           </w:p>
         </w:tc>
@@ -3882,7 +3882,7 @@
           </w:tcPr>
           <w:p>
             <w:r>
-              <w:t>No disponible</w:t>
+              <w:t>—</w:t>
             </w:r>
           </w:p>
         </w:tc>
@@ -3892,7 +3892,7 @@
           </w:tcPr>
           <w:p>
             <w:r>
-              <w:t>No disponible</w:t>
+              <w:t>—</w:t>
             </w:r>
           </w:p>
         </w:tc>
@@ -4058,7 +4058,7 @@
           </w:tcPr>
           <w:p>
             <w:r>
-              <w:t>No disponible</w:t>
+              <w:t>—</w:t>
             </w:r>
           </w:p>
         </w:tc>
@@ -4120,7 +4120,7 @@
           </w:tcPr>
           <w:p>
             <w:r>
-              <w:t>No disponible</w:t>
+              <w:t>—</w:t>
             </w:r>
           </w:p>
         </w:tc>
@@ -4182,7 +4182,7 @@
           </w:tcPr>
           <w:p>
             <w:r>
-              <w:t>No disponible</w:t>
+              <w:t>—</w:t>
             </w:r>
           </w:p>
         </w:tc>
@@ -4244,7 +4244,7 @@
           </w:tcPr>
           <w:p>
             <w:r>
-              <w:t>No disponible</w:t>
+              <w:t>—</w:t>
             </w:r>
           </w:p>
         </w:tc>
@@ -4306,7 +4306,7 @@
           </w:tcPr>
           <w:p>
             <w:r>
-              <w:t>No disponible</w:t>
+              <w:t>—</w:t>
             </w:r>
           </w:p>
         </w:tc>
@@ -4327,7 +4327,7 @@
     </w:p>
     <w:p>
       <w:r>
-        <w:t>En el ajuste in-sample, el optimizador convergió, el ajuste usó 3961 observaciones de Desarrollo, de las cuales 924 son incumplimientos y el pseudo-R² de McFadden es 0.0968.</w:t>
+        <w:t>En el ajuste in-sample, el optimizador convergió, el ajuste usó 3961 observaciones de Desarrollo, de las cuales 924 son incumplimientos y el pseudo-R² de McFadden es 0,0968.</w:t>
       </w:r>
     </w:p>
     <w:p>
@@ -4654,7 +4654,7 @@
           </w:tcPr>
           <w:p>
             <w:r>
-              <w:t>none</w:t>
+              <w:t>—</w:t>
             </w:r>
           </w:p>
         </w:tc>
@@ -4664,7 +4664,7 @@
           </w:tcPr>
           <w:p>
             <w:r>
-              <w:t>No disponible</w:t>
+              <w:t>—</w:t>
             </w:r>
           </w:p>
         </w:tc>
@@ -4674,7 +4674,7 @@
           </w:tcPr>
           <w:p>
             <w:r>
-              <w:t>nan</w:t>
+              <w:t>—</w:t>
             </w:r>
           </w:p>
         </w:tc>
@@ -4684,7 +4684,7 @@
           </w:tcPr>
           <w:p>
             <w:r>
-              <w:t>nan</w:t>
+              <w:t>—</w:t>
             </w:r>
           </w:p>
         </w:tc>
@@ -9865,7 +9865,7 @@
     </w:p>
     <w:p>
       <w:r>
-        <w:t>En Desarrollo, la PD media calibrada es 20.00 %, frente a 23.33 % antes de calibrar, contra una tasa de incumplimiento observada de 23.33 %.</w:t>
+        <w:t>En Desarrollo, la PD media calibrada es 20,00 %, frente a 23,33 % antes de calibrar, contra una tasa de incumplimiento observada de 23,33 %.</w:t>
       </w:r>
     </w:p>
     <w:p>
@@ -9933,17 +9933,17 @@
     </w:p>
     <w:p>
       <w:r>
-        <w:t>En Desarrollo el modelo alcanza AUC 0.7123, Gini 0.4247 y KS 0.3201.</w:t>
+        <w:t>En Desarrollo el modelo alcanza AUC 0,7123, Gini 0,4247 y KS 0,3201.</w:t>
       </w:r>
     </w:p>
     <w:p>
       <w:r>
-        <w:t>En Holdout el modelo alcanza AUC 0.6946, Gini 0.3893 y KS 0.3119.</w:t>
+        <w:t>En Holdout el modelo alcanza AUC 0,6946, Gini 0,3893 y KS 0,3119.</w:t>
       </w:r>
     </w:p>
     <w:p>
       <w:r>
-        <w:t>En Fuera de tiempo (OOT) el modelo alcanza AUC 0.6561, Gini 0.3122 y KS 0.2519.</w:t>
+        <w:t>En Fuera de tiempo (OOT) el modelo alcanza AUC 0,6561, Gini 0,3122 y KS 0,2519.</w:t>
       </w:r>
     </w:p>
     <w:p>
@@ -10329,7 +10329,7 @@
           </w:tcPr>
           <w:p>
             <w:r>
-              <w:t>No disponible</w:t>
+              <w:t>—</w:t>
             </w:r>
           </w:p>
         </w:tc>
@@ -10461,7 +10461,7 @@
           </w:tcPr>
           <w:p>
             <w:r>
-              <w:t>No disponible</w:t>
+              <w:t>—</w:t>
             </w:r>
           </w:p>
         </w:tc>
@@ -10593,7 +10593,7 @@
           </w:tcPr>
           <w:p>
             <w:r>
-              <w:t>No disponible</w:t>
+              <w:t>—</w:t>
             </w:r>
           </w:p>
         </w:tc>
@@ -17009,17 +17009,17 @@
     </w:p>
     <w:p>
       <w:r>
-        <w:t>El PSI del score en Desarrollo vs. Holdout es 0.0132 (banda «Estable»). La distribución del score se mantiene, de modo que no hay evidencia de desplazamiento poblacional.</w:t>
+        <w:t>El PSI del score en Desarrollo vs. Holdout es 0,0132 (banda «Estable»). La distribución del score se mantiene, de modo que no hay evidencia de desplazamiento poblacional.</w:t>
       </w:r>
     </w:p>
     <w:p>
       <w:r>
-        <w:t>El PSI del score en Desarrollo vs. OOT es 0.0068 (banda «Estable»). La distribución del score se mantiene, de modo que no hay evidencia de desplazamiento poblacional.</w:t>
+        <w:t>El PSI del score en Desarrollo vs. OOT es 0,0068 (banda «Estable»). La distribución del score se mantiene, de modo que no hay evidencia de desplazamiento poblacional.</w:t>
       </w:r>
     </w:p>
     <w:p>
       <w:r>
-        <w:t>A nivel de variable, el mayor CSI corresponde a «mora_max_12m__points» con 0.0102.</w:t>
+        <w:t>A nivel de variable, el mayor CSI corresponde a «mora_max_12m__points» con 0,0102.</w:t>
       </w:r>
     </w:p>
     <w:p>
@@ -17280,7 +17280,7 @@
           </w:tcPr>
           <w:p>
             <w:r>
-              <w:t>none</w:t>
+              <w:t>—</w:t>
             </w:r>
           </w:p>
         </w:tc>
@@ -17362,7 +17362,7 @@
           </w:tcPr>
           <w:p>
             <w:r>
-              <w:t>none</w:t>
+              <w:t>—</w:t>
             </w:r>
           </w:p>
         </w:tc>
@@ -17444,7 +17444,7 @@
           </w:tcPr>
           <w:p>
             <w:r>
-              <w:t>none</w:t>
+              <w:t>—</w:t>
             </w:r>
           </w:p>
         </w:tc>
@@ -17526,7 +17526,7 @@
           </w:tcPr>
           <w:p>
             <w:r>
-              <w:t>none</w:t>
+              <w:t>—</w:t>
             </w:r>
           </w:p>
         </w:tc>
@@ -17608,7 +17608,7 @@
           </w:tcPr>
           <w:p>
             <w:r>
-              <w:t>none</w:t>
+              <w:t>—</w:t>
             </w:r>
           </w:p>
         </w:tc>
@@ -17690,7 +17690,7 @@
           </w:tcPr>
           <w:p>
             <w:r>
-              <w:t>none</w:t>
+              <w:t>—</w:t>
             </w:r>
           </w:p>
         </w:tc>
@@ -17772,7 +17772,7 @@
           </w:tcPr>
           <w:p>
             <w:r>
-              <w:t>none</w:t>
+              <w:t>—</w:t>
             </w:r>
           </w:p>
         </w:tc>
@@ -17854,7 +17854,7 @@
           </w:tcPr>
           <w:p>
             <w:r>
-              <w:t>none</w:t>
+              <w:t>—</w:t>
             </w:r>
           </w:p>
         </w:tc>
@@ -17936,7 +17936,7 @@
           </w:tcPr>
           <w:p>
             <w:r>
-              <w:t>none</w:t>
+              <w:t>—</w:t>
             </w:r>
           </w:p>
         </w:tc>
@@ -18018,7 +18018,7 @@
           </w:tcPr>
           <w:p>
             <w:r>
-              <w:t>none</w:t>
+              <w:t>—</w:t>
             </w:r>
           </w:p>
         </w:tc>
@@ -18100,7 +18100,7 @@
           </w:tcPr>
           <w:p>
             <w:r>
-              <w:t>none</w:t>
+              <w:t>—</w:t>
             </w:r>
           </w:p>
         </w:tc>
@@ -18182,7 +18182,7 @@
           </w:tcPr>
           <w:p>
             <w:r>
-              <w:t>none</w:t>
+              <w:t>—</w:t>
             </w:r>
           </w:p>
         </w:tc>
@@ -18264,7 +18264,7 @@
           </w:tcPr>
           <w:p>
             <w:r>
-              <w:t>none</w:t>
+              <w:t>—</w:t>
             </w:r>
           </w:p>
         </w:tc>
@@ -18346,7 +18346,7 @@
           </w:tcPr>
           <w:p>
             <w:r>
-              <w:t>none</w:t>
+              <w:t>—</w:t>
             </w:r>
           </w:p>
         </w:tc>
@@ -18428,7 +18428,7 @@
           </w:tcPr>
           <w:p>
             <w:r>
-              <w:t>none</w:t>
+              <w:t>—</w:t>
             </w:r>
           </w:p>
         </w:tc>
@@ -30148,7 +30148,7 @@
           </w:tcPr>
           <w:p>
             <w:r>
-              <w:t>No disponible</w:t>
+              <w:t>—</w:t>
             </w:r>
           </w:p>
         </w:tc>
@@ -30240,7 +30240,7 @@
           </w:tcPr>
           <w:p>
             <w:r>
-              <w:t>No disponible</w:t>
+              <w:t>—</w:t>
             </w:r>
           </w:p>
         </w:tc>
@@ -30250,7 +30250,7 @@
           </w:tcPr>
           <w:p>
             <w:r>
-              <w:t>No disponible</w:t>
+              <w:t>—</w:t>
             </w:r>
           </w:p>
         </w:tc>
@@ -30260,7 +30260,7 @@
           </w:tcPr>
           <w:p>
             <w:r>
-              <w:t>No disponible</w:t>
+              <w:t>—</w:t>
             </w:r>
           </w:p>
         </w:tc>
@@ -30280,7 +30280,7 @@
           </w:tcPr>
           <w:p>
             <w:r>
-              <w:t>No disponible</w:t>
+              <w:t>—</w:t>
             </w:r>
           </w:p>
         </w:tc>
@@ -30412,7 +30412,7 @@
           </w:tcPr>
           <w:p>
             <w:r>
-              <w:t>No disponible</w:t>
+              <w:t>—</w:t>
             </w:r>
           </w:p>
         </w:tc>
@@ -30504,7 +30504,7 @@
           </w:tcPr>
           <w:p>
             <w:r>
-              <w:t>No disponible</w:t>
+              <w:t>—</w:t>
             </w:r>
           </w:p>
         </w:tc>
@@ -30514,7 +30514,7 @@
           </w:tcPr>
           <w:p>
             <w:r>
-              <w:t>No disponible</w:t>
+              <w:t>—</w:t>
             </w:r>
           </w:p>
         </w:tc>
@@ -30524,7 +30524,7 @@
           </w:tcPr>
           <w:p>
             <w:r>
-              <w:t>No disponible</w:t>
+              <w:t>—</w:t>
             </w:r>
           </w:p>
         </w:tc>
@@ -30544,7 +30544,7 @@
           </w:tcPr>
           <w:p>
             <w:r>
-              <w:t>No disponible</w:t>
+              <w:t>—</w:t>
             </w:r>
           </w:p>
         </w:tc>
@@ -30676,7 +30676,7 @@
           </w:tcPr>
           <w:p>
             <w:r>
-              <w:t>No disponible</w:t>
+              <w:t>—</w:t>
             </w:r>
           </w:p>
         </w:tc>
@@ -30768,7 +30768,7 @@
           </w:tcPr>
           <w:p>
             <w:r>
-              <w:t>No disponible</w:t>
+              <w:t>—</w:t>
             </w:r>
           </w:p>
         </w:tc>
@@ -30778,7 +30778,7 @@
           </w:tcPr>
           <w:p>
             <w:r>
-              <w:t>No disponible</w:t>
+              <w:t>—</w:t>
             </w:r>
           </w:p>
         </w:tc>
@@ -30788,7 +30788,7 @@
           </w:tcPr>
           <w:p>
             <w:r>
-              <w:t>No disponible</w:t>
+              <w:t>—</w:t>
             </w:r>
           </w:p>
         </w:tc>
@@ -30808,7 +30808,7 @@
           </w:tcPr>
           <w:p>
             <w:r>
-              <w:t>No disponible</w:t>
+              <w:t>—</w:t>
             </w:r>
           </w:p>
         </w:tc>
@@ -31077,7 +31077,7 @@
           </w:tcPr>
           <w:p>
             <w:r>
-              <w:t>none</w:t>
+              <w:t>—</w:t>
             </w:r>
           </w:p>
         </w:tc>
@@ -31189,7 +31189,7 @@
           </w:tcPr>
           <w:p>
             <w:r>
-              <w:t>none</w:t>
+              <w:t>—</w:t>
             </w:r>
           </w:p>
         </w:tc>
@@ -31301,7 +31301,7 @@
           </w:tcPr>
           <w:p>
             <w:r>
-              <w:t>none</w:t>
+              <w:t>—</w:t>
             </w:r>
           </w:p>
         </w:tc>
@@ -31413,7 +31413,7 @@
           </w:tcPr>
           <w:p>
             <w:r>
-              <w:t>none</w:t>
+              <w:t>—</w:t>
             </w:r>
           </w:p>
         </w:tc>
@@ -31525,7 +31525,7 @@
           </w:tcPr>
           <w:p>
             <w:r>
-              <w:t>none</w:t>
+              <w:t>—</w:t>
             </w:r>
           </w:p>
         </w:tc>
@@ -31637,7 +31637,7 @@
           </w:tcPr>
           <w:p>
             <w:r>
-              <w:t>none</w:t>
+              <w:t>—</w:t>
             </w:r>
           </w:p>
         </w:tc>
@@ -31749,7 +31749,7 @@
           </w:tcPr>
           <w:p>
             <w:r>
-              <w:t>none</w:t>
+              <w:t>—</w:t>
             </w:r>
           </w:p>
         </w:tc>
@@ -31861,7 +31861,7 @@
           </w:tcPr>
           <w:p>
             <w:r>
-              <w:t>none</w:t>
+              <w:t>—</w:t>
             </w:r>
           </w:p>
         </w:tc>
@@ -31973,7 +31973,7 @@
           </w:tcPr>
           <w:p>
             <w:r>
-              <w:t>none</w:t>
+              <w:t>—</w:t>
             </w:r>
           </w:p>
         </w:tc>
@@ -32085,7 +32085,7 @@
           </w:tcPr>
           <w:p>
             <w:r>
-              <w:t>none</w:t>
+              <w:t>—</w:t>
             </w:r>
           </w:p>
         </w:tc>
@@ -32197,7 +32197,7 @@
           </w:tcPr>
           <w:p>
             <w:r>
-              <w:t>none</w:t>
+              <w:t>—</w:t>
             </w:r>
           </w:p>
         </w:tc>
@@ -32309,7 +32309,7 @@
           </w:tcPr>
           <w:p>
             <w:r>
-              <w:t>none</w:t>
+              <w:t>—</w:t>
             </w:r>
           </w:p>
         </w:tc>
@@ -32421,7 +32421,7 @@
           </w:tcPr>
           <w:p>
             <w:r>
-              <w:t>none</w:t>
+              <w:t>—</w:t>
             </w:r>
           </w:p>
         </w:tc>
@@ -32533,7 +32533,7 @@
           </w:tcPr>
           <w:p>
             <w:r>
-              <w:t>none</w:t>
+              <w:t>—</w:t>
             </w:r>
           </w:p>
         </w:tc>
@@ -32645,7 +32645,7 @@
           </w:tcPr>
           <w:p>
             <w:r>
-              <w:t>none</w:t>
+              <w:t>—</w:t>
             </w:r>
           </w:p>
         </w:tc>
@@ -32691,17 +32691,17 @@
     </w:p>
     <w:p>
       <w:r>
-        <w:t>Discriminación (AUC): Desarrollo 0.7123, Holdout 0.6946 y Fuera de tiempo (OOT) 0.6561.</w:t>
+        <w:t>Discriminación (AUC): Desarrollo 0,7123, Holdout 0,6946 y Fuera de tiempo (OOT) 0,6561.</w:t>
       </w:r>
     </w:p>
     <w:p>
       <w:r>
-        <w:t>Estabilidad (PSI del score): Desarrollo vs. Holdout 0.0132 («Estable») y Desarrollo vs. OOT 0.0068 («Estable»).</w:t>
+        <w:t>Estabilidad (PSI del score): Desarrollo vs. Holdout 0,0132 («Estable») y Desarrollo vs. OOT 0,0068 («Estable»).</w:t>
       </w:r>
     </w:p>
     <w:p>
       <w:r>
-        <w:t>Calibración: la PD media calibrada en Desarrollo (20.00 %) se contrasta con la tasa observada (23.33 %).</w:t>
+        <w:t>Calibración: la PD media calibrada en Desarrollo (20,00 %) se contrasta con la tasa observada (23,33 %).</w:t>
       </w:r>
     </w:p>
     <w:p>
@@ -32799,7 +32799,7 @@
         <w:rPr>
           <w:rFonts w:ascii="Consolas" w:hAnsi="Consolas"/>
         </w:rPr>
-        <w:t>fc5021258eedde27bdbe0815d94a81eca5dd13ad405ba85d55d0cb6bb029edfc</w:t>
+        <w:t>4b93809debd102cf1644f8b5acaa9abbd693204e9f3fb7346f392425677ae49f</w:t>
       </w:r>
     </w:p>
     <w:p>
@@ -32815,7 +32815,7 @@
         <w:rPr>
           <w:rFonts w:ascii="Consolas" w:hAnsi="Consolas"/>
         </w:rPr>
-        <w:t>2026-07-20T18:30:36.644901Z</w:t>
+        <w:t>2026-07-21T01:17:56.105256Z</w:t>
       </w:r>
     </w:p>
     <w:p>
@@ -32879,7 +32879,7 @@
         <w:rPr>
           <w:rFonts w:ascii="Consolas" w:hAnsi="Consolas"/>
         </w:rPr>
-        <w:t>b74785875a9e62db1c71e1927fabdac49fb98753</w:t>
+        <w:t>f6160ad258db1846d6d1dc73ab688a1f1ac10951</w:t>
       </w:r>
     </w:p>
     <w:p>
@@ -32899,7 +32899,7 @@
         <w:br/>
         <w:t xml:space="preserve">  "PyYAML": "6.0.3",</w:t>
         <w:br/>
-        <w:t xml:space="preserve">  "nikodym": "1.3.0",</w:t>
+        <w:t xml:space="preserve">  "nikodym": "1.4.0",</w:t>
         <w:br/>
         <w:t xml:space="preserve">  "numpy": "2.4.6",</w:t>
         <w:br/>
@@ -32955,7 +32955,7 @@
         <w:rPr>
           <w:rFonts w:ascii="Consolas" w:hAnsi="Consolas"/>
         </w:rPr>
-        <w:t>No disponible</w:t>
+        <w:t>—</w:t>
       </w:r>
     </w:p>
     <w:p>
@@ -39534,7 +39534,7 @@
         <w:rPr>
           <w:rFonts w:ascii="Consolas" w:hAnsi="Consolas"/>
         </w:rPr>
-        <w:t>No disponible</w:t>
+        <w:t>—</w:t>
       </w:r>
     </w:p>
     <w:p>
@@ -40648,7 +40648,7 @@
         <w:rPr>
           <w:rFonts w:ascii="Consolas" w:hAnsi="Consolas"/>
         </w:rPr>
-        <w:t>No disponible</w:t>
+        <w:t>—</w:t>
       </w:r>
     </w:p>
     <w:p>
@@ -40664,7 +40664,7 @@
         <w:rPr>
           <w:rFonts w:ascii="Consolas" w:hAnsi="Consolas"/>
         </w:rPr>
-        <w:t>No disponible</w:t>
+        <w:t>—</w:t>
       </w:r>
     </w:p>
     <w:p>
@@ -41016,7 +41016,7 @@
         <w:rPr>
           <w:rFonts w:ascii="Consolas" w:hAnsi="Consolas"/>
         </w:rPr>
-        <w:t>No disponible</w:t>
+        <w:t>—</w:t>
       </w:r>
     </w:p>
     <w:p>
@@ -41160,7 +41160,7 @@
         <w:rPr>
           <w:rFonts w:ascii="Consolas" w:hAnsi="Consolas"/>
         </w:rPr>
-        <w:t>No disponible</w:t>
+        <w:t>—</w:t>
       </w:r>
     </w:p>
     <w:p>

</xml_diff>

<commit_message>
chore(demo): re-recapturar los 3 bundles con el formateo de Decimal
Recaptura de F3, F1 y F4 sobre el renderer corregido. Efecto medido en
las celdas de tabla del informe F3: los valores con 10+ decimales pasan
de 55 a 0 y las celdas `[]`/`{}` de 27 a 0 (verificado extrayendo los
3.381 `<td>`). Los decimales largos que quedan viven en los bloques
`<pre>` de JSON del anexo de auditoría, donde el volcado fiel es lo
correcto.

Sin movimiento de cifras: F3 estándar 697M · interno 309M · sobrecosto
$388.732.916; F1 AUC 0,7123 · Gini 0,4247 · KS 0,3201; F4 EAD
$114.325.315 · ECL $3.423.116 · cobertura 2,99 %. `config_hash` app ≡
informe en los tres, 0 rutas del host, `toyaml*` sin `report.document`.
</commit_message>
<xml_diff>
--- a/web/src/fixtures/demo/report-f1.docx
+++ b/web/src/fixtures/demo/report-f1.docx
@@ -199,7 +199,7 @@
         <w:rPr>
           <w:rFonts w:ascii="Consolas" w:hAnsi="Consolas"/>
         </w:rPr>
-        <w:t>git_sha=f6160ad258db1846d6d1dc73ab688a1f1ac10951</w:t>
+        <w:t>git_sha=4607855308f38a9befd991a9d51a07ac959fa161</w:t>
       </w:r>
     </w:p>
     <w:p>
@@ -32762,6 +32762,11 @@
     </w:p>
     <w:p>
       <w:r>
+        <w:t>Caveats de reproducibilidad declarados por la corrida: working tree git sucio: cambios sin commitear no reconstruibles.</w:t>
+      </w:r>
+    </w:p>
+    <w:p>
+      <w:r>
         <w:t>No hay secciones obligatorias ausentes en esta corrida.</w:t>
       </w:r>
     </w:p>
@@ -32815,7 +32820,7 @@
         <w:rPr>
           <w:rFonts w:ascii="Consolas" w:hAnsi="Consolas"/>
         </w:rPr>
-        <w:t>2026-07-21T01:17:56.105256Z</w:t>
+        <w:t>2026-07-21T01:27:57.411961Z</w:t>
       </w:r>
     </w:p>
     <w:p>
@@ -32847,7 +32852,11 @@
         <w:rPr>
           <w:rFonts w:ascii="Consolas" w:hAnsi="Consolas"/>
         </w:rPr>
-        <w:t>[]</w:t>
+        <w:t>[</w:t>
+        <w:br/>
+        <w:t xml:space="preserve">  "working tree git sucio: cambios sin commitear no reconstruibles"</w:t>
+        <w:br/>
+        <w:t>]</w:t>
       </w:r>
     </w:p>
     <w:p>
@@ -32863,7 +32872,7 @@
         <w:rPr>
           <w:rFonts w:ascii="Consolas" w:hAnsi="Consolas"/>
         </w:rPr>
-        <w:t>false</w:t>
+        <w:t>true</w:t>
       </w:r>
     </w:p>
     <w:p>
@@ -32879,7 +32888,7 @@
         <w:rPr>
           <w:rFonts w:ascii="Consolas" w:hAnsi="Consolas"/>
         </w:rPr>
-        <w:t>f6160ad258db1846d6d1dc73ab688a1f1ac10951</w:t>
+        <w:t>4607855308f38a9befd991a9d51a07ac959fa161</w:t>
       </w:r>
     </w:p>
     <w:p>

</xml_diff>

<commit_message>
chore(demo): recapturar los 3 bundles con el informe corregido
F3 y F1 pasan a llevar sus tablas anchas en hoja apaisada (11 y 12 de
60/57 páginas del PDF); F4 no tiene ninguna tabla de 10+ columnas y
queda íntegramente vertical, pero su tabla insignia ya se titula
«Pérdida crediticia esperada (ECL) por etapa» en vez de la clave del
motor.

Sin movimiento de cifras ni de identidad: `config_hash` app ≡ informe en
los tres (66cfffd0 / 4b93809d / cbe5d9fa), lineage 1.4.0, 0 celdas
crudas, 0 rutas del host, insignias F4 intactas (EAD $114.325.315 · ECL
$3.423.116 · 2,99 %).
</commit_message>
<xml_diff>
--- a/web/src/fixtures/demo/report-f1.docx
+++ b/web/src/fixtures/demo/report-f1.docx
@@ -199,7 +199,7 @@
         <w:rPr>
           <w:rFonts w:ascii="Consolas" w:hAnsi="Consolas"/>
         </w:rPr>
-        <w:t>git_sha=4607855308f38a9befd991a9d51a07ac959fa161</w:t>
+        <w:t>git_sha=ad5fe58dcdc5eededee97a4d4d7c3c4b8ef979af</w:t>
       </w:r>
     </w:p>
     <w:p>
@@ -32820,7 +32820,7 @@
         <w:rPr>
           <w:rFonts w:ascii="Consolas" w:hAnsi="Consolas"/>
         </w:rPr>
-        <w:t>2026-07-21T01:27:57.411961Z</w:t>
+        <w:t>2026-07-21T01:52:21.484318Z</w:t>
       </w:r>
     </w:p>
     <w:p>
@@ -32888,7 +32888,7 @@
         <w:rPr>
           <w:rFonts w:ascii="Consolas" w:hAnsi="Consolas"/>
         </w:rPr>
-        <w:t>4607855308f38a9befd991a9d51a07ac959fa161</w:t>
+        <w:t>ad5fe58dcdc5eededee97a4d4d7c3c4b8ef979af</w:t>
       </w:r>
     </w:p>
     <w:p>

</xml_diff>

<commit_message>
chore(demo): recapturar los 3 bundles con la prosa en lenguaje de negocio
Verificado sobre el artefacto: cero apariciones de DTO, ValidationResult,
DataCardSection, «el step», «las cards», SDD-16/28 y SemVer en el texto
visible de los tres informes. Identidad y cifras intactas: config_hash
app ≡ informe, lineage 1.4.0, insignias F4 y título editorial de la tabla
ECL.
</commit_message>
<xml_diff>
--- a/web/src/fixtures/demo/report-f1.docx
+++ b/web/src/fixtures/demo/report-f1.docx
@@ -199,7 +199,7 @@
         <w:rPr>
           <w:rFonts w:ascii="Consolas" w:hAnsi="Consolas"/>
         </w:rPr>
-        <w:t>git_sha=ad5fe58dcdc5eededee97a4d4d7c3c4b8ef979af</w:t>
+        <w:t>git_sha=88e0067e761252671b02016e74e329c5965da95d</w:t>
       </w:r>
     </w:p>
     <w:p>
@@ -1045,7 +1045,7 @@
     </w:p>
     <w:p>
       <w:r>
-        <w:t>La columna objetivo publicada por data es «target».</w:t>
+        <w:t>La columna objetivo de esta corrida es «target».</w:t>
       </w:r>
     </w:p>
     <w:p>
@@ -1101,7 +1101,7 @@
     </w:p>
     <w:p>
       <w:r>
-        <w:t>Las tablas siguientes son una proyección de presentación del DataCardSection publicado por data. Estados, tamaños y tasas por partición, y exclusiones se copian literalmente; el informe no recalcula ni completa valores ausentes.</w:t>
+        <w:t>Las tablas siguientes reproducen lo que dejó la preparación de datos de esta corrida. Estados, tamaños y tasas por partición, y exclusiones se copian literalmente; el informe no recalcula ni completa valores ausentes.</w:t>
       </w:r>
     </w:p>
     <w:p>
@@ -29375,7 +29375,7 @@
     </w:p>
     <w:p>
       <w:r>
-        <w:t>El resultado registra 3 tests, de los cuales 3 quedaron fallidos. Las tablas se copian del ValidationResult atómico, sin recalcular métricas ni decisiones.</w:t>
+        <w:t>El resultado registra 3 tests, de los cuales 3 quedaron fallidos. Las tablas se copian del resultado que publicó la validación, sin recalcular métricas ni decisiones.</w:t>
       </w:r>
     </w:p>
     <w:p>
@@ -29426,7 +29426,7 @@
     </w:p>
     <w:p>
       <w:r>
-        <w:t>La tabla reproduce por partición AUC, Gini y KS, junto con población, fuente y estado de evaluabilidad. Filas publicadas por el DTO: 3.</w:t>
+        <w:t>La tabla reproduce por partición AUC, Gini y KS, junto con población, fuente y estado de evaluabilidad. Filas evaluadas: 3.</w:t>
       </w:r>
     </w:p>
     <w:p>
@@ -29817,7 +29817,7 @@
     </w:p>
     <w:p>
       <w:r>
-        <w:t>La tabla reúne Hosmer-Lemeshow, Brier y, cuando fue configurado, el contraste por grado con sus decisiones y semáforo publicados. Filas publicadas por el DTO: 6.</w:t>
+        <w:t>La tabla reúne Hosmer-Lemeshow, Brier y, cuando fue configurado, el contraste por grado con sus decisiones y semáforo publicados. Filas evaluadas: 6.</w:t>
       </w:r>
     </w:p>
     <w:p>
@@ -30824,7 +30824,7 @@
     </w:p>
     <w:p>
       <w:r>
-        <w:t>La tabla reproduce PSI/estabilidad, umbrales, banda, acción y decisión publicados por validation. Filas publicadas por el DTO: 15.</w:t>
+        <w:t>La tabla reproduce PSI/estabilidad, umbrales, banda, acción y la decisión que dejó la validación. Filas evaluadas: 15.</w:t>
       </w:r>
     </w:p>
     <w:p>
@@ -32820,7 +32820,7 @@
         <w:rPr>
           <w:rFonts w:ascii="Consolas" w:hAnsi="Consolas"/>
         </w:rPr>
-        <w:t>2026-07-21T01:52:21.484318Z</w:t>
+        <w:t>2026-07-21T02:08:21.583822Z</w:t>
       </w:r>
     </w:p>
     <w:p>
@@ -32888,7 +32888,7 @@
         <w:rPr>
           <w:rFonts w:ascii="Consolas" w:hAnsi="Consolas"/>
         </w:rPr>
-        <w:t>ad5fe58dcdc5eededee97a4d4d7c3c4b8ef979af</w:t>
+        <w:t>88e0067e761252671b02016e74e329c5965da95d</w:t>
       </w:r>
     </w:p>
     <w:p>

</xml_diff>

<commit_message>
chore(demo): recapturar el bundle F1 con la calibración anclada en los datos
Badge del resumen ejecutivo: «3 de 3 tests fallidos» -> «1 de 3». El que
queda es Hosmer-Lemeshow en OOT (p=0,0126), deriva temporal de la cartera;
desarrollo (p=0,65) y holdout (p=0,26) pasan. Discriminación invariante:
AUC 0,7123 · Gini 0,4247 · KS 0,3201.
</commit_message>
<xml_diff>
--- a/web/src/fixtures/demo/report-f1.docx
+++ b/web/src/fixtures/demo/report-f1.docx
@@ -183,7 +183,7 @@
         <w:rPr>
           <w:rFonts w:ascii="Consolas" w:hAnsi="Consolas"/>
         </w:rPr>
-        <w:t>config_hash=4b93809debd102cf1644f8b5acaa9abbd693204e9f3fb7346f392425677ae49f</w:t>
+        <w:t>config_hash=ec10eb43314cad2e369584c7dabe4bbf2456391e255a2b69218d405bba2a448e</w:t>
       </w:r>
     </w:p>
     <w:p>
@@ -199,7 +199,7 @@
         <w:rPr>
           <w:rFonts w:ascii="Consolas" w:hAnsi="Consolas"/>
         </w:rPr>
-        <w:t>git_sha=88e0067e761252671b02016e74e329c5965da95d</w:t>
+        <w:t>git_sha=d7eb9944ad06affd8939c6a4370de9908d6b8541</w:t>
       </w:r>
     </w:p>
     <w:p>
@@ -949,7 +949,7 @@
           </w:tcPr>
           <w:p>
             <w:r>
-              <w:t>3 de 3 tests fallidos</w:t>
+              <w:t>1 de 3 tests fallidos</w:t>
             </w:r>
           </w:p>
         </w:tc>
@@ -1621,12 +1621,12 @@
     </w:p>
     <w:p>
       <w:r>
-        <w:t>La PD se calibró por desplazamiento del intercepto (intercept offset), ajustando sobre la partición de Desarrollo contra un ancla de negocio declarada explícitamente, con una PD objetivo de 20,00 %. El ancla es a través del ciclo (TTC).</w:t>
+        <w:t>La PD se calibró por desplazamiento del intercepto (intercept offset), ajustando sobre la partición de Desarrollo contra la tasa de incumplimiento observada en Desarrollo, con una PD objetivo de 23,33 %. El ancla es a través del ciclo (TTC).</w:t>
       </w:r>
     </w:p>
     <w:p>
       <w:r>
-        <w:t>El desplazamiento aplicado al intercepto es -0,2184, lo que preserva el ordenamiento del score: la calibración corrige el nivel de la PD, no su ranking.</w:t>
+        <w:t>El desplazamiento aplicado al intercepto es -0,0000, lo que preserva el ordenamiento del score: la calibración corrige el nivel de la PD, no su ranking.</w:t>
       </w:r>
     </w:p>
     <w:p>
@@ -9865,7 +9865,7 @@
     </w:p>
     <w:p>
       <w:r>
-        <w:t>En Desarrollo, la PD media calibrada es 20,00 %, frente a 23,33 % antes de calibrar, contra una tasa de incumplimiento observada de 23,33 %.</w:t>
+        <w:t>En Desarrollo, la PD media calibrada es 23,33 %, frente a 23,33 % antes de calibrar, contra una tasa de incumplimiento observada de 23,33 %.</w:t>
       </w:r>
     </w:p>
     <w:p>
@@ -10319,7 +10319,7 @@
           </w:tcPr>
           <w:p>
             <w:r>
-              <w:t>0.189651</w:t>
+              <w:t>0.225512</w:t>
             </w:r>
           </w:p>
         </w:tc>
@@ -10451,7 +10451,7 @@
           </w:tcPr>
           <w:p>
             <w:r>
-              <w:t>0.223207</w:t>
+              <w:t>0.263350</w:t>
             </w:r>
           </w:p>
         </w:tc>
@@ -10583,7 +10583,7 @@
           </w:tcPr>
           <w:p>
             <w:r>
-              <w:t>0.259595</w:t>
+              <w:t>0.303724</w:t>
             </w:r>
           </w:p>
         </w:tc>
@@ -11015,7 +11015,7 @@
           </w:tcPr>
           <w:p>
             <w:r>
-              <w:t>0.464277</w:t>
+              <w:t>0.517250</w:t>
             </w:r>
           </w:p>
         </w:tc>
@@ -11025,7 +11025,7 @@
           </w:tcPr>
           <w:p>
             <w:r>
-              <w:t>0.368829</w:t>
+              <w:t>0.420969</w:t>
             </w:r>
           </w:p>
         </w:tc>
@@ -11035,7 +11035,7 @@
           </w:tcPr>
           <w:p>
             <w:r>
-              <w:t>0.774565</w:t>
+              <w:t>0.810416</w:t>
             </w:r>
           </w:p>
         </w:tc>
@@ -11217,7 +11217,7 @@
           </w:tcPr>
           <w:p>
             <w:r>
-              <w:t>0.326896</w:t>
+              <w:t>0.376530</w:t>
             </w:r>
           </w:p>
         </w:tc>
@@ -11227,7 +11227,7 @@
           </w:tcPr>
           <w:p>
             <w:r>
-              <w:t>0.293402</w:t>
+              <w:t>0.340634</w:t>
             </w:r>
           </w:p>
         </w:tc>
@@ -11237,7 +11237,7 @@
           </w:tcPr>
           <w:p>
             <w:r>
-              <w:t>0.368829</w:t>
+              <w:t>0.420969</w:t>
             </w:r>
           </w:p>
         </w:tc>
@@ -11419,7 +11419,7 @@
           </w:tcPr>
           <w:p>
             <w:r>
-              <w:t>0.269114</w:t>
+              <w:t>0.314126</w:t>
             </w:r>
           </w:p>
         </w:tc>
@@ -11429,7 +11429,7 @@
           </w:tcPr>
           <w:p>
             <w:r>
-              <w:t>0.245896</w:t>
+              <w:t>0.288604</w:t>
             </w:r>
           </w:p>
         </w:tc>
@@ -11439,7 +11439,7 @@
           </w:tcPr>
           <w:p>
             <w:r>
-              <w:t>0.293402</w:t>
+              <w:t>0.340634</w:t>
             </w:r>
           </w:p>
         </w:tc>
@@ -11621,7 +11621,7 @@
           </w:tcPr>
           <w:p>
             <w:r>
-              <w:t>0.227482</w:t>
+              <w:t>0.268100</w:t>
             </w:r>
           </w:p>
         </w:tc>
@@ -11631,7 +11631,7 @@
           </w:tcPr>
           <w:p>
             <w:r>
-              <w:t>0.208969</w:t>
+              <w:t>0.247367</w:t>
             </w:r>
           </w:p>
         </w:tc>
@@ -11641,7 +11641,7 @@
           </w:tcPr>
           <w:p>
             <w:r>
-              <w:t>0.245896</w:t>
+              <w:t>0.288604</w:t>
             </w:r>
           </w:p>
         </w:tc>
@@ -11823,7 +11823,7 @@
           </w:tcPr>
           <w:p>
             <w:r>
-              <w:t>0.192104</w:t>
+              <w:t>0.228273</w:t>
             </w:r>
           </w:p>
         </w:tc>
@@ -11833,7 +11833,7 @@
           </w:tcPr>
           <w:p>
             <w:r>
-              <w:t>0.176307</w:t>
+              <w:t>0.210299</w:t>
             </w:r>
           </w:p>
         </w:tc>
@@ -11843,7 +11843,7 @@
           </w:tcPr>
           <w:p>
             <w:r>
-              <w:t>0.208969</w:t>
+              <w:t>0.247367</w:t>
             </w:r>
           </w:p>
         </w:tc>
@@ -12025,7 +12025,7 @@
           </w:tcPr>
           <w:p>
             <w:r>
-              <w:t>0.160814</w:t>
+              <w:t>0.192500</w:t>
             </w:r>
           </w:p>
         </w:tc>
@@ -12035,7 +12035,7 @@
           </w:tcPr>
           <w:p>
             <w:r>
-              <w:t>0.147936</w:t>
+              <w:t>0.177638</w:t>
             </w:r>
           </w:p>
         </w:tc>
@@ -12045,7 +12045,7 @@
           </w:tcPr>
           <w:p>
             <w:r>
-              <w:t>0.176307</w:t>
+              <w:t>0.210299</w:t>
             </w:r>
           </w:p>
         </w:tc>
@@ -12227,7 +12227,7 @@
           </w:tcPr>
           <w:p>
             <w:r>
-              <w:t>0.133788</w:t>
+              <w:t>0.161168</w:t>
             </w:r>
           </w:p>
         </w:tc>
@@ -12237,7 +12237,7 @@
           </w:tcPr>
           <w:p>
             <w:r>
-              <w:t>0.120596</w:t>
+              <w:t>0.145748</w:t>
             </w:r>
           </w:p>
         </w:tc>
@@ -12247,7 +12247,7 @@
           </w:tcPr>
           <w:p>
             <w:r>
-              <w:t>0.147936</w:t>
+              <w:t>0.177638</w:t>
             </w:r>
           </w:p>
         </w:tc>
@@ -12429,7 +12429,7 @@
           </w:tcPr>
           <w:p>
             <w:r>
-              <w:t>0.105434</w:t>
+              <w:t>0.127862</w:t>
             </w:r>
           </w:p>
         </w:tc>
@@ -12439,7 +12439,7 @@
           </w:tcPr>
           <w:p>
             <w:r>
-              <w:t>0.090212</w:t>
+              <w:t>0.109818</w:t>
             </w:r>
           </w:p>
         </w:tc>
@@ -12449,7 +12449,7 @@
           </w:tcPr>
           <w:p>
             <w:r>
-              <w:t>0.120596</w:t>
+              <w:t>0.145748</w:t>
             </w:r>
           </w:p>
         </w:tc>
@@ -12631,7 +12631,7 @@
           </w:tcPr>
           <w:p>
             <w:r>
-              <w:t>0.076569</w:t>
+              <w:t>0.093494</w:t>
             </w:r>
           </w:p>
         </w:tc>
@@ -12641,7 +12641,7 @@
           </w:tcPr>
           <w:p>
             <w:r>
-              <w:t>0.061318</w:t>
+              <w:t>0.075163</w:t>
             </w:r>
           </w:p>
         </w:tc>
@@ -12651,7 +12651,7 @@
           </w:tcPr>
           <w:p>
             <w:r>
-              <w:t>0.090107</w:t>
+              <w:t>0.109693</w:t>
             </w:r>
           </w:p>
         </w:tc>
@@ -12833,7 +12833,7 @@
           </w:tcPr>
           <w:p>
             <w:r>
-              <w:t>0.042856</w:t>
+              <w:t>0.052725</w:t>
             </w:r>
           </w:p>
         </w:tc>
@@ -12843,7 +12843,7 @@
           </w:tcPr>
           <w:p>
             <w:r>
-              <w:t>0.008485</w:t>
+              <w:t>0.010535</w:t>
             </w:r>
           </w:p>
         </w:tc>
@@ -12853,7 +12853,7 @@
           </w:tcPr>
           <w:p>
             <w:r>
-              <w:t>0.061318</w:t>
+              <w:t>0.075163</w:t>
             </w:r>
           </w:p>
         </w:tc>
@@ -13035,7 +13035,7 @@
           </w:tcPr>
           <w:p>
             <w:r>
-              <w:t>0.480290</w:t>
+              <w:t>0.533095</w:t>
             </w:r>
           </w:p>
         </w:tc>
@@ -13045,7 +13045,7 @@
           </w:tcPr>
           <w:p>
             <w:r>
-              <w:t>0.368464</w:t>
+              <w:t>0.420586</w:t>
             </w:r>
           </w:p>
         </w:tc>
@@ -13055,7 +13055,7 @@
           </w:tcPr>
           <w:p>
             <w:r>
-              <w:t>0.732205</w:t>
+              <w:t>0.772817</w:t>
             </w:r>
           </w:p>
         </w:tc>
@@ -13237,7 +13237,7 @@
           </w:tcPr>
           <w:p>
             <w:r>
-              <w:t>0.332514</w:t>
+              <w:t>0.382540</w:t>
             </w:r>
           </w:p>
         </w:tc>
@@ -13247,7 +13247,7 @@
           </w:tcPr>
           <w:p>
             <w:r>
-              <w:t>0.298887</w:t>
+              <w:t>0.346569</w:t>
             </w:r>
           </w:p>
         </w:tc>
@@ -13257,7 +13257,7 @@
           </w:tcPr>
           <w:p>
             <w:r>
-              <w:t>0.368464</w:t>
+              <w:t>0.420586</w:t>
             </w:r>
           </w:p>
         </w:tc>
@@ -13439,7 +13439,7 @@
           </w:tcPr>
           <w:p>
             <w:r>
-              <w:t>0.274019</w:t>
+              <w:t>0.319495</w:t>
             </w:r>
           </w:p>
         </w:tc>
@@ -13449,7 +13449,7 @@
           </w:tcPr>
           <w:p>
             <w:r>
-              <w:t>0.250344</w:t>
+              <w:t>0.293524</w:t>
             </w:r>
           </w:p>
         </w:tc>
@@ -13459,7 +13459,7 @@
           </w:tcPr>
           <w:p>
             <w:r>
-              <w:t>0.298887</w:t>
+              <w:t>0.346569</w:t>
             </w:r>
           </w:p>
         </w:tc>
@@ -13641,7 +13641,7 @@
           </w:tcPr>
           <w:p>
             <w:r>
-              <w:t>0.225597</w:t>
+              <w:t>0.265979</w:t>
             </w:r>
           </w:p>
         </w:tc>
@@ -13651,7 +13651,7 @@
           </w:tcPr>
           <w:p>
             <w:r>
-              <w:t>0.204709</w:t>
+              <w:t>0.242564</w:t>
             </w:r>
           </w:p>
         </w:tc>
@@ -13661,7 +13661,7 @@
           </w:tcPr>
           <w:p>
             <w:r>
-              <w:t>0.250344</w:t>
+              <w:t>0.293524</w:t>
             </w:r>
           </w:p>
         </w:tc>
@@ -13843,7 +13843,7 @@
           </w:tcPr>
           <w:p>
             <w:r>
-              <w:t>0.188267</w:t>
+              <w:t>0.223916</w:t>
             </w:r>
           </w:p>
         </w:tc>
@@ -13853,7 +13853,7 @@
           </w:tcPr>
           <w:p>
             <w:r>
-              <w:t>0.173891</w:t>
+              <w:t>0.207535</w:t>
             </w:r>
           </w:p>
         </w:tc>
@@ -13863,7 +13863,7 @@
           </w:tcPr>
           <w:p>
             <w:r>
-              <w:t>0.204661</w:t>
+              <w:t>0.242510</w:t>
             </w:r>
           </w:p>
         </w:tc>
@@ -14045,7 +14045,7 @@
           </w:tcPr>
           <w:p>
             <w:r>
-              <w:t>0.162510</w:t>
+              <w:t>0.194459</w:t>
             </w:r>
           </w:p>
         </w:tc>
@@ -14055,7 +14055,7 @@
           </w:tcPr>
           <w:p>
             <w:r>
-              <w:t>0.152213</w:t>
+              <w:t>0.182590</w:t>
             </w:r>
           </w:p>
         </w:tc>
@@ -14065,7 +14065,7 @@
           </w:tcPr>
           <w:p>
             <w:r>
-              <w:t>0.173846</w:t>
+              <w:t>0.207483</w:t>
             </w:r>
           </w:p>
         </w:tc>
@@ -14247,7 +14247,7 @@
           </w:tcPr>
           <w:p>
             <w:r>
-              <w:t>0.138393</w:t>
+              <w:t>0.166537</w:t>
             </w:r>
           </w:p>
         </w:tc>
@@ -14257,7 +14257,7 @@
           </w:tcPr>
           <w:p>
             <w:r>
-              <w:t>0.124609</w:t>
+              <w:t>0.150454</w:t>
             </w:r>
           </w:p>
         </w:tc>
@@ -14267,7 +14267,7 @@
           </w:tcPr>
           <w:p>
             <w:r>
-              <w:t>0.151995</w:t>
+              <w:t>0.182337</w:t>
             </w:r>
           </w:p>
         </w:tc>
@@ -14449,7 +14449,7 @@
           </w:tcPr>
           <w:p>
             <w:r>
-              <w:t>0.106735</w:t>
+              <w:t>0.129392</w:t>
             </w:r>
           </w:p>
         </w:tc>
@@ -14459,7 +14459,7 @@
           </w:tcPr>
           <w:p>
             <w:r>
-              <w:t>0.090472</w:t>
+              <w:t>0.110128</w:t>
             </w:r>
           </w:p>
         </w:tc>
@@ -14469,7 +14469,7 @@
           </w:tcPr>
           <w:p>
             <w:r>
-              <w:t>0.124343</w:t>
+              <w:t>0.150142</w:t>
             </w:r>
           </w:p>
         </w:tc>
@@ -14651,7 +14651,7 @@
           </w:tcPr>
           <w:p>
             <w:r>
-              <w:t>0.076171</w:t>
+              <w:t>0.093017</w:t>
             </w:r>
           </w:p>
         </w:tc>
@@ -14661,7 +14661,7 @@
           </w:tcPr>
           <w:p>
             <w:r>
-              <w:t>0.059697</w:t>
+              <w:t>0.073204</w:t>
             </w:r>
           </w:p>
         </w:tc>
@@ -14671,7 +14671,7 @@
           </w:tcPr>
           <w:p>
             <w:r>
-              <w:t>0.090212</w:t>
+              <w:t>0.109818</w:t>
             </w:r>
           </w:p>
         </w:tc>
@@ -14853,7 +14853,7 @@
           </w:tcPr>
           <w:p>
             <w:r>
-              <w:t>0.044013</w:t>
+              <w:t>0.054147</w:t>
             </w:r>
           </w:p>
         </w:tc>
@@ -14863,7 +14863,7 @@
           </w:tcPr>
           <w:p>
             <w:r>
-              <w:t>0.014361</w:t>
+              <w:t>0.017805</w:t>
             </w:r>
           </w:p>
         </w:tc>
@@ -14873,7 +14873,7 @@
           </w:tcPr>
           <w:p>
             <w:r>
-              <w:t>0.059655</w:t>
+              <w:t>0.073154</w:t>
             </w:r>
           </w:p>
         </w:tc>
@@ -15055,7 +15055,7 @@
           </w:tcPr>
           <w:p>
             <w:r>
-              <w:t>0.480221</w:t>
+              <w:t>0.532996</w:t>
             </w:r>
           </w:p>
         </w:tc>
@@ -15065,7 +15065,7 @@
           </w:tcPr>
           <w:p>
             <w:r>
-              <w:t>0.376923</w:t>
+              <w:t>0.429429</w:t>
             </w:r>
           </w:p>
         </w:tc>
@@ -15075,7 +15075,7 @@
           </w:tcPr>
           <w:p>
             <w:r>
-              <w:t>0.732205</w:t>
+              <w:t>0.772817</w:t>
             </w:r>
           </w:p>
         </w:tc>
@@ -15257,7 +15257,7 @@
           </w:tcPr>
           <w:p>
             <w:r>
-              <w:t>0.329443</w:t>
+              <w:t>0.379217</w:t>
             </w:r>
           </w:p>
         </w:tc>
@@ -15267,7 +15267,7 @@
           </w:tcPr>
           <w:p>
             <w:r>
-              <w:t>0.291975</w:t>
+              <w:t>0.339087</w:t>
             </w:r>
           </w:p>
         </w:tc>
@@ -15277,7 +15277,7 @@
           </w:tcPr>
           <w:p>
             <w:r>
-              <w:t>0.376607</w:t>
+              <w:t>0.429099</w:t>
             </w:r>
           </w:p>
         </w:tc>
@@ -15459,7 +15459,7 @@
           </w:tcPr>
           <w:p>
             <w:r>
-              <w:t>0.265686</w:t>
+              <w:t>0.310365</w:t>
             </w:r>
           </w:p>
         </w:tc>
@@ -15469,7 +15469,7 @@
           </w:tcPr>
           <w:p>
             <w:r>
-              <w:t>0.242490</w:t>
+              <w:t>0.284830</w:t>
             </w:r>
           </w:p>
         </w:tc>
@@ -15479,7 +15479,7 @@
           </w:tcPr>
           <w:p>
             <w:r>
-              <w:t>0.291014</w:t>
+              <w:t>0.338045</w:t>
             </w:r>
           </w:p>
         </w:tc>
@@ -15661,7 +15661,7 @@
           </w:tcPr>
           <w:p>
             <w:r>
-              <w:t>0.224310</w:t>
+              <w:t>0.264552</w:t>
             </w:r>
           </w:p>
         </w:tc>
@@ -15671,7 +15671,7 @@
           </w:tcPr>
           <w:p>
             <w:r>
-              <w:t>0.203208</w:t>
+              <w:t>0.240870</w:t>
             </w:r>
           </w:p>
         </w:tc>
@@ -15681,7 +15681,7 @@
           </w:tcPr>
           <w:p>
             <w:r>
-              <w:t>0.242120</w:t>
+              <w:t>0.284419</w:t>
             </w:r>
           </w:p>
         </w:tc>
@@ -15863,7 +15863,7 @@
           </w:tcPr>
           <w:p>
             <w:r>
-              <w:t>0.184714</w:t>
+              <w:t>0.219868</w:t>
             </w:r>
           </w:p>
         </w:tc>
@@ -15873,7 +15873,7 @@
           </w:tcPr>
           <w:p>
             <w:r>
-              <w:t>0.168869</w:t>
+              <w:t>0.201778</w:t>
             </w:r>
           </w:p>
         </w:tc>
@@ -15883,7 +15883,7 @@
           </w:tcPr>
           <w:p>
             <w:r>
-              <w:t>0.202989</w:t>
+              <w:t>0.240622</w:t>
             </w:r>
           </w:p>
         </w:tc>
@@ -16065,7 +16065,7 @@
           </w:tcPr>
           <w:p>
             <w:r>
-              <w:t>0.157103</w:t>
+              <w:t>0.188226</w:t>
             </w:r>
           </w:p>
         </w:tc>
@@ -16075,7 +16075,7 @@
           </w:tcPr>
           <w:p>
             <w:r>
-              <w:t>0.144751</w:t>
+              <w:t>0.173944</w:t>
             </w:r>
           </w:p>
         </w:tc>
@@ -16085,7 +16085,7 @@
           </w:tcPr>
           <w:p>
             <w:r>
-              <w:t>0.168869</w:t>
+              <w:t>0.201778</w:t>
             </w:r>
           </w:p>
         </w:tc>
@@ -16267,7 +16267,7 @@
           </w:tcPr>
           <w:p>
             <w:r>
-              <w:t>0.132068</w:t>
+              <w:t>0.159166</w:t>
             </w:r>
           </w:p>
         </w:tc>
@@ -16277,7 +16277,7 @@
           </w:tcPr>
           <w:p>
             <w:r>
-              <w:t>0.120596</w:t>
+              <w:t>0.145748</w:t>
             </w:r>
           </w:p>
         </w:tc>
@@ -16287,7 +16287,7 @@
           </w:tcPr>
           <w:p>
             <w:r>
-              <w:t>0.144751</w:t>
+              <w:t>0.173944</w:t>
             </w:r>
           </w:p>
         </w:tc>
@@ -16469,7 +16469,7 @@
           </w:tcPr>
           <w:p>
             <w:r>
-              <w:t>0.106984</w:t>
+              <w:t>0.129697</w:t>
             </w:r>
           </w:p>
         </w:tc>
@@ -16479,7 +16479,7 @@
           </w:tcPr>
           <w:p>
             <w:r>
-              <w:t>0.092326</w:t>
+              <w:t>0.112335</w:t>
             </w:r>
           </w:p>
         </w:tc>
@@ -16489,7 +16489,7 @@
           </w:tcPr>
           <w:p>
             <w:r>
-              <w:t>0.119822</w:t>
+              <w:t>0.144838</w:t>
             </w:r>
           </w:p>
         </w:tc>
@@ -16671,7 +16671,7 @@
           </w:tcPr>
           <w:p>
             <w:r>
-              <w:t>0.076182</w:t>
+              <w:t>0.093027</w:t>
             </w:r>
           </w:p>
         </w:tc>
@@ -16681,7 +16681,7 @@
           </w:tcPr>
           <w:p>
             <w:r>
-              <w:t>0.061411</w:t>
+              <w:t>0.075275</w:t>
             </w:r>
           </w:p>
         </w:tc>
@@ -16691,7 +16691,7 @@
           </w:tcPr>
           <w:p>
             <w:r>
-              <w:t>0.091239</w:t>
+              <w:t>0.111041</w:t>
             </w:r>
           </w:p>
         </w:tc>
@@ -16873,7 +16873,7 @@
           </w:tcPr>
           <w:p>
             <w:r>
-              <w:t>0.043492</w:t>
+              <w:t>0.053499</w:t>
             </w:r>
           </w:p>
         </w:tc>
@@ -16883,7 +16883,7 @@
           </w:tcPr>
           <w:p>
             <w:r>
-              <w:t>0.007587</w:t>
+              <w:t>0.009422</w:t>
             </w:r>
           </w:p>
         </w:tc>
@@ -16893,7 +16893,7 @@
           </w:tcPr>
           <w:p>
             <w:r>
-              <w:t>0.061318</w:t>
+              <w:t>0.075163</w:t>
             </w:r>
           </w:p>
         </w:tc>
@@ -29375,7 +29375,7 @@
     </w:p>
     <w:p>
       <w:r>
-        <w:t>El resultado registra 3 tests, de los cuales 3 quedaron fallidos. Las tablas se copian del resultado que publicó la validación, sin recalcular métricas ni decisiones.</w:t>
+        <w:t>El resultado registra 3 tests, de los cuales 1 quedaron fallidos. Las tablas se copian del resultado que publicó la validación, sin recalcular métricas ni decisiones.</w:t>
       </w:r>
     </w:p>
     <w:p>
@@ -30078,7 +30078,7 @@
           </w:tcPr>
           <w:p>
             <w:r>
-              <w:t>0.200000</w:t>
+              <w:t>0.233274</w:t>
             </w:r>
           </w:p>
         </w:tc>
@@ -30098,7 +30098,7 @@
           </w:tcPr>
           <w:p>
             <w:r>
-              <w:t>37.243376</w:t>
+              <w:t>6.007946</w:t>
             </w:r>
           </w:p>
         </w:tc>
@@ -30118,7 +30118,7 @@
           </w:tcPr>
           <w:p>
             <w:r>
-              <w:t>0.000010</w:t>
+              <w:t>0.646342</w:t>
             </w:r>
           </w:p>
         </w:tc>
@@ -30138,7 +30138,7 @@
           </w:tcPr>
           <w:p>
             <w:r>
-              <w:t>fail</w:t>
+              <w:t>pass</w:t>
             </w:r>
           </w:p>
         </w:tc>
@@ -30210,7 +30210,7 @@
           </w:tcPr>
           <w:p>
             <w:r>
-              <w:t>0.200000</w:t>
+              <w:t>0.233274</w:t>
             </w:r>
           </w:p>
         </w:tc>
@@ -30230,7 +30230,7 @@
           </w:tcPr>
           <w:p>
             <w:r>
-              <w:t>0.161492</w:t>
+              <w:t>0.160175</w:t>
             </w:r>
           </w:p>
         </w:tc>
@@ -30342,7 +30342,7 @@
           </w:tcPr>
           <w:p>
             <w:r>
-              <w:t>0.200298</w:t>
+              <w:t>0.233378</w:t>
             </w:r>
           </w:p>
         </w:tc>
@@ -30362,7 +30362,7 @@
           </w:tcPr>
           <w:p>
             <w:r>
-              <w:t>32.223459</w:t>
+              <w:t>19.451071</w:t>
             </w:r>
           </w:p>
         </w:tc>
@@ -30382,7 +30382,7 @@
           </w:tcPr>
           <w:p>
             <w:r>
-              <w:t>0.000085</w:t>
+              <w:t>0.012625</w:t>
             </w:r>
           </w:p>
         </w:tc>
@@ -30474,7 +30474,7 @@
           </w:tcPr>
           <w:p>
             <w:r>
-              <w:t>0.200298</w:t>
+              <w:t>0.233378</w:t>
             </w:r>
           </w:p>
         </w:tc>
@@ -30494,7 +30494,7 @@
           </w:tcPr>
           <w:p>
             <w:r>
-              <w:t>0.171861</w:t>
+              <w:t>0.171278</w:t>
             </w:r>
           </w:p>
         </w:tc>
@@ -30606,7 +30606,7 @@
           </w:tcPr>
           <w:p>
             <w:r>
-              <w:t>0.203120</w:t>
+              <w:t>0.236546</w:t>
             </w:r>
           </w:p>
         </w:tc>
@@ -30626,7 +30626,7 @@
           </w:tcPr>
           <w:p>
             <w:r>
-              <w:t>19.983637</w:t>
+              <w:t>10.120587</w:t>
             </w:r>
           </w:p>
         </w:tc>
@@ -30646,7 +30646,7 @@
           </w:tcPr>
           <w:p>
             <w:r>
-              <w:t>0.010398</w:t>
+              <w:t>0.256664</w:t>
             </w:r>
           </w:p>
         </w:tc>
@@ -30666,7 +30666,7 @@
           </w:tcPr>
           <w:p>
             <w:r>
-              <w:t>fail</w:t>
+              <w:t>pass</w:t>
             </w:r>
           </w:p>
         </w:tc>
@@ -30738,7 +30738,7 @@
           </w:tcPr>
           <w:p>
             <w:r>
-              <w:t>0.203120</w:t>
+              <w:t>0.236546</w:t>
             </w:r>
           </w:p>
         </w:tc>
@@ -30758,7 +30758,7 @@
           </w:tcPr>
           <w:p>
             <w:r>
-              <w:t>0.165269</w:t>
+              <w:t>0.164275</w:t>
             </w:r>
           </w:p>
         </w:tc>
@@ -32701,7 +32701,7 @@
     </w:p>
     <w:p>
       <w:r>
-        <w:t>Calibración: la PD media calibrada en Desarrollo (20,00 %) se contrasta con la tasa observada (23,33 %).</w:t>
+        <w:t>Calibración: la PD media calibrada en Desarrollo (23,33 %) se contrasta con la tasa observada (23,33 %).</w:t>
       </w:r>
     </w:p>
     <w:p>
@@ -32762,11 +32762,6 @@
     </w:p>
     <w:p>
       <w:r>
-        <w:t>Caveats de reproducibilidad declarados por la corrida: working tree git sucio: cambios sin commitear no reconstruibles.</w:t>
-      </w:r>
-    </w:p>
-    <w:p>
-      <w:r>
         <w:t>No hay secciones obligatorias ausentes en esta corrida.</w:t>
       </w:r>
     </w:p>
@@ -32804,7 +32799,7 @@
         <w:rPr>
           <w:rFonts w:ascii="Consolas" w:hAnsi="Consolas"/>
         </w:rPr>
-        <w:t>4b93809debd102cf1644f8b5acaa9abbd693204e9f3fb7346f392425677ae49f</w:t>
+        <w:t>ec10eb43314cad2e369584c7dabe4bbf2456391e255a2b69218d405bba2a448e</w:t>
       </w:r>
     </w:p>
     <w:p>
@@ -32820,7 +32815,7 @@
         <w:rPr>
           <w:rFonts w:ascii="Consolas" w:hAnsi="Consolas"/>
         </w:rPr>
-        <w:t>2026-07-21T02:08:21.583822Z</w:t>
+        <w:t>2026-07-21T15:38:23.684071Z</w:t>
       </w:r>
     </w:p>
     <w:p>
@@ -32852,11 +32847,7 @@
         <w:rPr>
           <w:rFonts w:ascii="Consolas" w:hAnsi="Consolas"/>
         </w:rPr>
-        <w:t>[</w:t>
-        <w:br/>
-        <w:t xml:space="preserve">  "working tree git sucio: cambios sin commitear no reconstruibles"</w:t>
-        <w:br/>
-        <w:t>]</w:t>
+        <w:t>[]</w:t>
       </w:r>
     </w:p>
     <w:p>
@@ -32872,7 +32863,7 @@
         <w:rPr>
           <w:rFonts w:ascii="Consolas" w:hAnsi="Consolas"/>
         </w:rPr>
-        <w:t>true</w:t>
+        <w:t>false</w:t>
       </w:r>
     </w:p>
     <w:p>
@@ -32888,7 +32879,7 @@
         <w:rPr>
           <w:rFonts w:ascii="Consolas" w:hAnsi="Consolas"/>
         </w:rPr>
-        <w:t>88e0067e761252671b02016e74e329c5965da95d</w:t>
+        <w:t>d7eb9944ad06affd8939c6a4370de9908d6b8541</w:t>
       </w:r>
     </w:p>
     <w:p>
@@ -40391,9 +40382,9 @@
         </w:rPr>
         <w:t>{</w:t>
         <w:br/>
-        <w:t xml:space="preserve">  "aic": "3898.715734",</w:t>
+        <w:t xml:space="preserve">  "aic": "3898.72",</w:t>
         <w:br/>
-        <w:t xml:space="preserve">  "bic": "3936.421245",</w:t>
+        <w:t xml:space="preserve">  "bic": "3936.42",</w:t>
         <w:br/>
         <w:t xml:space="preserve">  "converged": true,</w:t>
         <w:br/>
@@ -40401,7 +40392,7 @@
         <w:br/>
         <w:t xml:space="preserve">  "llr_p_value": "0.000000",</w:t>
         <w:br/>
-        <w:t xml:space="preserve">  "log_likelihood": "-1943.357867",</w:t>
+        <w:t xml:space="preserve">  "log_likelihood": "-1943.36",</w:t>
         <w:br/>
         <w:t xml:space="preserve">  "n_events_dev": 924,</w:t>
         <w:br/>
@@ -40411,7 +40402,7 @@
         <w:br/>
         <w:t xml:space="preserve">  "n_obs_dev": 3961,</w:t>
         <w:br/>
-        <w:t xml:space="preserve">  "null_log_likelihood": "-2151.625879",</w:t>
+        <w:t xml:space="preserve">  "null_log_likelihood": "-2151.63",</w:t>
         <w:br/>
         <w:t xml:space="preserve">  "optimizer": "newton",</w:t>
         <w:br/>
@@ -40901,7 +40892,7 @@
         <w:rPr>
           <w:rFonts w:ascii="Consolas" w:hAnsi="Consolas"/>
         </w:rPr>
-        <w:t>business_input</w:t>
+        <w:t>development_observed</w:t>
       </w:r>
     </w:p>
     <w:p>
@@ -40917,7 +40908,7 @@
         <w:rPr>
           <w:rFonts w:ascii="Consolas" w:hAnsi="Consolas"/>
         </w:rPr>
-        <w:t>0.2000</w:t>
+        <w:t>0.2333</w:t>
       </w:r>
     </w:p>
     <w:p>
@@ -40961,7 +40952,7 @@
         <w:br/>
         <w:t xml:space="preserve">  "anchor_kind": "through_the_cycle",</w:t>
         <w:br/>
-        <w:t xml:space="preserve">  "anchor_source": "business_input",</w:t>
+        <w:t xml:space="preserve">  "anchor_source": "development_observed",</w:t>
         <w:br/>
         <w:t xml:space="preserve">  "fit_partition": "desarrollo",</w:t>
         <w:br/>
@@ -40987,7 +40978,7 @@
         <w:br/>
         <w:t xml:space="preserve">  "target_column": "target",</w:t>
         <w:br/>
-        <w:t xml:space="preserve">  "target_pd": "0.200000",</w:t>
+        <w:t xml:space="preserve">  "target_pd": null,</w:t>
         <w:br/>
         <w:t xml:space="preserve">  "target_tolerance": "0.000000",</w:t>
         <w:br/>
@@ -41089,7 +41080,7 @@
         <w:rPr>
           <w:rFonts w:ascii="Consolas" w:hAnsi="Consolas"/>
         </w:rPr>
-        <w:t>-0.218447</w:t>
+        <w:t>-0.000000</w:t>
       </w:r>
     </w:p>
     <w:p>
@@ -41185,7 +41176,7 @@
         <w:rPr>
           <w:rFonts w:ascii="Consolas" w:hAnsi="Consolas"/>
         </w:rPr>
-        <w:t>0.200000</w:t>
+        <w:t>0.233274</w:t>
       </w:r>
     </w:p>
     <w:p>
@@ -42073,7 +42064,7 @@
         <w:rPr>
           <w:rFonts w:ascii="Consolas" w:hAnsi="Consolas"/>
         </w:rPr>
-        <w:t>3</w:t>
+        <w:t>1</w:t>
       </w:r>
     </w:p>
     <w:p>
@@ -42141,7 +42132,7 @@
         <w:br/>
         <w:t xml:space="preserve">  ],</w:t>
         <w:br/>
-        <w:t xml:space="preserve">  "n_failed": 3,</w:t>
+        <w:t xml:space="preserve">  "n_failed": 1,</w:t>
         <w:br/>
         <w:t xml:space="preserve">  "n_tests": 3,</w:t>
         <w:br/>

</xml_diff>

<commit_message>
chore(demo): recapturar F1 con lineage 1.4.1
</commit_message>
<xml_diff>
--- a/web/src/fixtures/demo/report-f1.docx
+++ b/web/src/fixtures/demo/report-f1.docx
@@ -199,7 +199,7 @@
         <w:rPr>
           <w:rFonts w:ascii="Consolas" w:hAnsi="Consolas"/>
         </w:rPr>
-        <w:t>git_sha=d7eb9944ad06affd8939c6a4370de9908d6b8541</w:t>
+        <w:t>git_sha=ae3d9c7e2aa3abc8930aba607f56417744efd6b2</w:t>
       </w:r>
     </w:p>
     <w:p>
@@ -32815,7 +32815,7 @@
         <w:rPr>
           <w:rFonts w:ascii="Consolas" w:hAnsi="Consolas"/>
         </w:rPr>
-        <w:t>2026-07-21T15:38:23.684071Z</w:t>
+        <w:t>2026-07-21T17:01:30.435299Z</w:t>
       </w:r>
     </w:p>
     <w:p>
@@ -32879,7 +32879,7 @@
         <w:rPr>
           <w:rFonts w:ascii="Consolas" w:hAnsi="Consolas"/>
         </w:rPr>
-        <w:t>d7eb9944ad06affd8939c6a4370de9908d6b8541</w:t>
+        <w:t>ae3d9c7e2aa3abc8930aba607f56417744efd6b2</w:t>
       </w:r>
     </w:p>
     <w:p>
@@ -32899,7 +32899,7 @@
         <w:br/>
         <w:t xml:space="preserve">  "PyYAML": "6.0.3",</w:t>
         <w:br/>
-        <w:t xml:space="preserve">  "nikodym": "1.4.0",</w:t>
+        <w:t xml:space="preserve">  "nikodym": "1.4.1",</w:t>
         <w:br/>
         <w:t xml:space="preserve">  "numpy": "2.4.6",</w:t>
         <w:br/>

</xml_diff>

<commit_message>
chore(demo): recapturar F1 sobre árbol limpio
La tanda anterior corrió los tres scripts en un bucle sin commit entre medio:
la captura de F3 dejó el árbol sucio y F1 y F4 heredaron la declaración de
no-reproducibilidad. El patrón es captura + commit atómico POR bundle.
</commit_message>
<xml_diff>
--- a/web/src/fixtures/demo/report-f1.docx
+++ b/web/src/fixtures/demo/report-f1.docx
@@ -199,7 +199,7 @@
         <w:rPr>
           <w:rFonts w:ascii="Consolas" w:hAnsi="Consolas"/>
         </w:rPr>
-        <w:t>git_sha=9b851201c8b66056dbc98947fef0c7d9a3877118</w:t>
+        <w:t>git_sha=b0dd07422ac85376e6ad9a0543093f6beb1733b0</w:t>
       </w:r>
     </w:p>
     <w:p>
@@ -32762,11 +32762,6 @@
     </w:p>
     <w:p>
       <w:r>
-        <w:t>Caveats de reproducibilidad declarados por la corrida: working tree git sucio: cambios sin commitear no reconstruibles.</w:t>
-      </w:r>
-    </w:p>
-    <w:p>
-      <w:r>
         <w:t>No hay secciones obligatorias ausentes en esta corrida.</w:t>
       </w:r>
     </w:p>
@@ -32820,7 +32815,7 @@
         <w:rPr>
           <w:rFonts w:ascii="Consolas" w:hAnsi="Consolas"/>
         </w:rPr>
-        <w:t>2026-07-21T17:19:04.256023Z</w:t>
+        <w:t>2026-07-21T17:23:49.618002Z</w:t>
       </w:r>
     </w:p>
     <w:p>
@@ -32852,11 +32847,7 @@
         <w:rPr>
           <w:rFonts w:ascii="Consolas" w:hAnsi="Consolas"/>
         </w:rPr>
-        <w:t>[</w:t>
-        <w:br/>
-        <w:t xml:space="preserve">  "working tree git sucio: cambios sin commitear no reconstruibles"</w:t>
-        <w:br/>
-        <w:t>]</w:t>
+        <w:t>[]</w:t>
       </w:r>
     </w:p>
     <w:p>
@@ -32872,7 +32863,7 @@
         <w:rPr>
           <w:rFonts w:ascii="Consolas" w:hAnsi="Consolas"/>
         </w:rPr>
-        <w:t>true</w:t>
+        <w:t>false</w:t>
       </w:r>
     </w:p>
     <w:p>
@@ -32888,7 +32879,7 @@
         <w:rPr>
           <w:rFonts w:ascii="Consolas" w:hAnsi="Consolas"/>
         </w:rPr>
-        <w:t>9b851201c8b66056dbc98947fef0c7d9a3877118</w:t>
+        <w:t>b0dd07422ac85376e6ad9a0543093f6beb1733b0</w:t>
       </w:r>
     </w:p>
     <w:p>

</xml_diff>

<commit_message>
chore(demo): recapturar F1 con lineage 1.5.0
Corrida real sobre arbol limpio (git_dirty=false, git_sha=e06d21f) con
PYTHONHASHSEED=0 y el DYLD que WeasyPrint necesita en macOS.

Cifras insignia invariantes: AUC 0,7123 · Gini 0,4247 · KS 0,3201, con
desarrollo como la particion mas fuerte.

Co-Authored-By: Claude Opus 4.8 <noreply@anthropic.com>
</commit_message>
<xml_diff>
--- a/web/src/fixtures/demo/report-f1.docx
+++ b/web/src/fixtures/demo/report-f1.docx
@@ -163,7 +163,7 @@
           </w:tcPr>
           <w:p>
             <w:r>
-              <w:t>2026-07-21</w:t>
+              <w:t>2026-07-22</w:t>
             </w:r>
           </w:p>
         </w:tc>
@@ -199,7 +199,7 @@
         <w:rPr>
           <w:rFonts w:ascii="Consolas" w:hAnsi="Consolas"/>
         </w:rPr>
-        <w:t>git_sha=b0dd07422ac85376e6ad9a0543093f6beb1733b0</w:t>
+        <w:t>git_sha=e06d21f07c904ea99c184fdd814ddc4186058c55</w:t>
       </w:r>
     </w:p>
     <w:p>
@@ -3740,7 +3740,7 @@
           </w:tcPr>
           <w:p>
             <w:r>
-              <w:t>iv=0.00292240935993 &lt; min_iv=0.02</w:t>
+              <w:t>iv=0.00292241 &lt; min_iv=0.02</w:t>
             </w:r>
           </w:p>
         </w:tc>
@@ -32815,7 +32815,7 @@
         <w:rPr>
           <w:rFonts w:ascii="Consolas" w:hAnsi="Consolas"/>
         </w:rPr>
-        <w:t>2026-07-21T17:23:49.618002Z</w:t>
+        <w:t>2026-07-22T17:23:27.839328Z</w:t>
       </w:r>
     </w:p>
     <w:p>
@@ -32879,7 +32879,7 @@
         <w:rPr>
           <w:rFonts w:ascii="Consolas" w:hAnsi="Consolas"/>
         </w:rPr>
-        <w:t>b0dd07422ac85376e6ad9a0543093f6beb1733b0</w:t>
+        <w:t>e06d21f07c904ea99c184fdd814ddc4186058c55</w:t>
       </w:r>
     </w:p>
     <w:p>
@@ -32899,7 +32899,7 @@
         <w:br/>
         <w:t xml:space="preserve">  "PyYAML": "6.0.3",</w:t>
         <w:br/>
-        <w:t xml:space="preserve">  "nikodym": "1.4.1",</w:t>
+        <w:t xml:space="preserve">  "nikodym": "1.5.0",</w:t>
         <w:br/>
         <w:t xml:space="preserve">  "numpy": "2.4.6",</w:t>
         <w:br/>

</xml_diff>

<commit_message>
chore(demo): recapturar los tres sets y reconstruir el bundle con la marca nueva
Los tres informes se recapturaron desde corridas reales sobre árbol limpio, y el
bundle empaquetado se regeneró con `pnpm build:package` (dos veces, byte-idénticas).

Lo único que se movió en los fixtures es el lineage: git_sha, created_at y run_id.
Ninguna cifra ni ningún texto de negocio cambió, y era la predicción falsable de la
enmienda: el único código que el informe imprime es FALTA-DATO-IFRS-4, que es una
brecha real del motor y conserva su marca. Si aquí hubiera aparecido un número
distinto, el renombrado habría tocado algo que no debía.

Números insignia verificados sobre el fixture recapturado:
ECL $3.423.116 · EAD $114.325.315 · cobertura 2,99 %.
</commit_message>
<xml_diff>
--- a/web/src/fixtures/demo/report-f1.docx
+++ b/web/src/fixtures/demo/report-f1.docx
@@ -199,7 +199,7 @@
         <w:rPr>
           <w:rFonts w:ascii="Consolas" w:hAnsi="Consolas"/>
         </w:rPr>
-        <w:t>git_sha=2293cbc2abaf24f5cda86d88a9a1057a3399af45</w:t>
+        <w:t>git_sha=d897c7f95857b24686c5e46274b5fcc5115d9876</w:t>
       </w:r>
     </w:p>
     <w:p>
@@ -32820,7 +32820,7 @@
         <w:rPr>
           <w:rFonts w:ascii="Consolas" w:hAnsi="Consolas"/>
         </w:rPr>
-        <w:t>2026-07-25T00:21:46.185435Z</w:t>
+        <w:t>2026-07-25T01:58:23.415813Z</w:t>
       </w:r>
     </w:p>
     <w:p>
@@ -32888,7 +32888,7 @@
         <w:rPr>
           <w:rFonts w:ascii="Consolas" w:hAnsi="Consolas"/>
         </w:rPr>
-        <w:t>2293cbc2abaf24f5cda86d88a9a1057a3399af45</w:t>
+        <w:t>d897c7f95857b24686c5e46274b5fcc5115d9876</w:t>
       </w:r>
     </w:p>
     <w:p>

</xml_diff>

<commit_message>
chore(demo): recaptura F1 y el hash F4 del front deja de contradecir al backend
La suite del front congelaba el config_hash F4 anterior a portfolio_scheme: es
exactamente el gate que existe para que la identidad UI↔código no se separe en silencio,
y se actualiza al mismo valor fijado del lado Python.

Fuera del alcance de la enmienda, aprovechando que el árbol está limpio y las nativas de
WeasyPrint resueltas: recaptura del set F1, que arrastraba git_dirty=true —el defecto
anotado por el que la demo no demostraba su paso 5—. Ahora los tres informes de la demo
declaran git_dirty=false, o sea son reproducibles.

Verificado sobre el artefacto: 5 variables, AUC desarrollo 0.7123 / holdout 0.6946 / OOT
0.6561, y el catálogo compartido con ifrs9_retail_latam reconcilia.

Front: 272 tests verdes y tsc limpio.
</commit_message>
<xml_diff>
--- a/web/src/fixtures/demo/report-f1.docx
+++ b/web/src/fixtures/demo/report-f1.docx
@@ -199,7 +199,7 @@
         <w:rPr>
           <w:rFonts w:ascii="Consolas" w:hAnsi="Consolas"/>
         </w:rPr>
-        <w:t>git_sha=d897c7f95857b24686c5e46274b5fcc5115d9876</w:t>
+        <w:t>git_sha=c79f05bf85fdc24d1cb6a126e575b9b1d19d651d</w:t>
       </w:r>
     </w:p>
     <w:p>
@@ -32762,11 +32762,6 @@
     </w:p>
     <w:p>
       <w:r>
-        <w:t>Caveats de reproducibilidad declarados por la corrida: working tree git sucio: cambios sin commitear no reconstruibles.</w:t>
-      </w:r>
-    </w:p>
-    <w:p>
-      <w:r>
         <w:t>No hay secciones obligatorias ausentes en esta corrida.</w:t>
       </w:r>
     </w:p>
@@ -32820,7 +32815,7 @@
         <w:rPr>
           <w:rFonts w:ascii="Consolas" w:hAnsi="Consolas"/>
         </w:rPr>
-        <w:t>2026-07-25T01:58:23.415813Z</w:t>
+        <w:t>2026-07-25T22:26:55.713892Z</w:t>
       </w:r>
     </w:p>
     <w:p>
@@ -32852,11 +32847,7 @@
         <w:rPr>
           <w:rFonts w:ascii="Consolas" w:hAnsi="Consolas"/>
         </w:rPr>
-        <w:t>[</w:t>
-        <w:br/>
-        <w:t xml:space="preserve">  "working tree git sucio: cambios sin commitear no reconstruibles"</w:t>
-        <w:br/>
-        <w:t>]</w:t>
+        <w:t>[]</w:t>
       </w:r>
     </w:p>
     <w:p>
@@ -32872,7 +32863,7 @@
         <w:rPr>
           <w:rFonts w:ascii="Consolas" w:hAnsi="Consolas"/>
         </w:rPr>
-        <w:t>true</w:t>
+        <w:t>false</w:t>
       </w:r>
     </w:p>
     <w:p>
@@ -32888,7 +32879,7 @@
         <w:rPr>
           <w:rFonts w:ascii="Consolas" w:hAnsi="Consolas"/>
         </w:rPr>
-        <w:t>d897c7f95857b24686c5e46274b5fcc5115d9876</w:t>
+        <w:t>c79f05bf85fdc24d1cb6a126e575b9b1d19d651d</w:t>
       </w:r>
     </w:p>
     <w:p>

</xml_diff>

<commit_message>
chore(demo): recaptura F1 con lineage 1.6.0
Primera de las tres capturas del patrón C-D. Los informes embeben
`library_versions.nikodym`, así que el bump tenía que ir antes y cada captura
va en su propio commit: con el árbol sucio el informe se declara irreproducible.
</commit_message>
<xml_diff>
--- a/web/src/fixtures/demo/report-f1.docx
+++ b/web/src/fixtures/demo/report-f1.docx
@@ -163,7 +163,7 @@
           </w:tcPr>
           <w:p>
             <w:r>
-              <w:t>2026-07-25</w:t>
+              <w:t>2026-07-26</w:t>
             </w:r>
           </w:p>
         </w:tc>
@@ -199,7 +199,7 @@
         <w:rPr>
           <w:rFonts w:ascii="Consolas" w:hAnsi="Consolas"/>
         </w:rPr>
-        <w:t>git_sha=c79f05bf85fdc24d1cb6a126e575b9b1d19d651d</w:t>
+        <w:t>git_sha=b0f7eb27d19b59db4be8e83f41ceb881bacf16d0</w:t>
       </w:r>
     </w:p>
     <w:p>
@@ -32815,7 +32815,7 @@
         <w:rPr>
           <w:rFonts w:ascii="Consolas" w:hAnsi="Consolas"/>
         </w:rPr>
-        <w:t>2026-07-25T22:26:55.713892Z</w:t>
+        <w:t>2026-07-26T16:27:07.758277Z</w:t>
       </w:r>
     </w:p>
     <w:p>
@@ -32879,7 +32879,7 @@
         <w:rPr>
           <w:rFonts w:ascii="Consolas" w:hAnsi="Consolas"/>
         </w:rPr>
-        <w:t>c79f05bf85fdc24d1cb6a126e575b9b1d19d651d</w:t>
+        <w:t>b0f7eb27d19b59db4be8e83f41ceb881bacf16d0</w:t>
       </w:r>
     </w:p>
     <w:p>
@@ -32899,7 +32899,7 @@
         <w:br/>
         <w:t xml:space="preserve">  "PyYAML": "6.0.3",</w:t>
         <w:br/>
-        <w:t xml:space="preserve">  "nikodym": "1.5.0",</w:t>
+        <w:t xml:space="preserve">  "nikodym": "1.6.0",</w:t>
         <w:br/>
         <w:t xml:space="preserve">  "numpy": "2.4.6",</w:t>
         <w:br/>

</xml_diff>

<commit_message>
chore(demo): recaptura del bundle F1 sobre 1.10.0 — la demo publicaba la versión equivocada
El fixture llevaba desde el 26 de julio y su lineage decía `nikodym 1.8.0`
mientras la librería publicada va en `1.10.0`: `importlib.metadata` seguía
sirviendo la versión vieja del editable install. Se repuso con
`uv sync --reinstall-package nikodym` ANTES de capturar.

Lo que la recaptura hace visible en la demo: `results.json` ya trae su bloque
de lineage —`config_hash`, `data_hash`, `git_sha`, versiones de librería—, que
antes no publicaba ninguno. Las cifras no se movieron (AUC 0,7123 / 0,6946 /
0,6561), que es la prueba de que la corrida es reproducible: los únicos campos
distintos del `results` son `run_id` y el lineage nuevo.

Capturado sobre árbol limpio y con `git_dirty=false` verificado en el informe
recién escrito, no sólo en `git status` antes de empezar.
</commit_message>
<xml_diff>
--- a/web/src/fixtures/demo/report-f1.docx
+++ b/web/src/fixtures/demo/report-f1.docx
@@ -163,7 +163,7 @@
           </w:tcPr>
           <w:p>
             <w:r>
-              <w:t>2026-07-26</w:t>
+              <w:t>2026-08-03</w:t>
             </w:r>
           </w:p>
         </w:tc>
@@ -199,7 +199,7 @@
         <w:rPr>
           <w:rFonts w:ascii="Consolas" w:hAnsi="Consolas"/>
         </w:rPr>
-        <w:t>git_sha=b0f7eb27d19b59db4be8e83f41ceb881bacf16d0</w:t>
+        <w:t>git_sha=d2f2b87116f07917191b396533c2da855ba8ff6c</w:t>
       </w:r>
     </w:p>
     <w:p>
@@ -32815,7 +32815,7 @@
         <w:rPr>
           <w:rFonts w:ascii="Consolas" w:hAnsi="Consolas"/>
         </w:rPr>
-        <w:t>2026-07-26T16:27:07.758277Z</w:t>
+        <w:t>2026-08-03T00:05:02.231202Z</w:t>
       </w:r>
     </w:p>
     <w:p>
@@ -32879,7 +32879,7 @@
         <w:rPr>
           <w:rFonts w:ascii="Consolas" w:hAnsi="Consolas"/>
         </w:rPr>
-        <w:t>b0f7eb27d19b59db4be8e83f41ceb881bacf16d0</w:t>
+        <w:t>d2f2b87116f07917191b396533c2da855ba8ff6c</w:t>
       </w:r>
     </w:p>
     <w:p>
@@ -32899,7 +32899,7 @@
         <w:br/>
         <w:t xml:space="preserve">  "PyYAML": "6.0.3",</w:t>
         <w:br/>
-        <w:t xml:space="preserve">  "nikodym": "1.6.0",</w:t>
+        <w:t xml:space="preserve">  "nikodym": "1.10.0",</w:t>
         <w:br/>
         <w:t xml:space="preserve">  "numpy": "2.4.6",</w:t>
         <w:br/>
@@ -39687,6 +39687,22 @@
         <w:t xml:space="preserve">  "variable_overrides": []</w:t>
         <w:br/>
         <w:t>}</w:t>
+      </w:r>
+    </w:p>
+    <w:p>
+      <w:r>
+        <w:rPr>
+          <w:b/>
+        </w:rPr>
+        <w:t>excluded_by_target_rule</w:t>
+      </w:r>
+    </w:p>
+    <w:p>
+      <w:r>
+        <w:rPr>
+          <w:rFonts w:ascii="Consolas" w:hAnsi="Consolas"/>
+        </w:rPr>
+        <w:t>[]</w:t>
       </w:r>
     </w:p>
     <w:p>

</xml_diff>

<commit_message>
Recaptura demo F1 con resumen PSI coherente
</commit_message>
<xml_diff>
--- a/web/src/fixtures/demo/report-f1.docx
+++ b/web/src/fixtures/demo/report-f1.docx
@@ -163,7 +163,7 @@
           </w:tcPr>
           <w:p>
             <w:r>
-              <w:t>2026-08-03</w:t>
+              <w:t>2026-08-09</w:t>
             </w:r>
           </w:p>
         </w:tc>
@@ -199,7 +199,7 @@
         <w:rPr>
           <w:rFonts w:ascii="Consolas" w:hAnsi="Consolas"/>
         </w:rPr>
-        <w:t>git_sha=d2f2b87116f07917191b396533c2da855ba8ff6c</w:t>
+        <w:t>git_sha=6f1936374b2e6e6fe33e3d4a9ed1c5aea2a0e9bc</w:t>
       </w:r>
     </w:p>
     <w:p>
@@ -845,7 +845,7 @@
           </w:tcPr>
           <w:p>
             <w:r>
-              <w:t>PSI del score</w:t>
+              <w:t>Peor PSI entre score y PD · PD calibrada</w:t>
             </w:r>
           </w:p>
         </w:tc>
@@ -887,7 +887,7 @@
           </w:tcPr>
           <w:p>
             <w:r>
-              <w:t>PSI del score</w:t>
+              <w:t>Peor PSI entre score y PD · score</w:t>
             </w:r>
           </w:p>
         </w:tc>
@@ -978,7 +978,7 @@
         <w:rPr>
           <w:i/>
         </w:rPr>
-        <w:t>Las bandas de PSI usan los umbrales configurados: estable por debajo de 0,10 y redesarrollo por sobre 0,25.</w:t>
+        <w:t>Las bandas de PSI usan los umbrales configurados: estable por debajo de 0,10, revisión desde 0,10 y redesarrollo desde 0,25.</w:t>
       </w:r>
     </w:p>
     <w:p>
@@ -1506,7 +1506,7 @@
     </w:p>
     <w:p>
       <w:r>
-        <w:t>En el tratamiento de faltantes se rechaza toda variable con más de 99,00 % de valores faltantes.</w:t>
+        <w:t>En el tratamiento de faltantes se reporta para revisión toda variable con más de 99,00 % de valores faltantes, sin eliminarla automáticamente.</w:t>
       </w:r>
     </w:p>
     <w:p>
@@ -1547,7 +1547,7 @@
     </w:p>
     <w:p>
       <w:r>
-        <w:t>Se descartaron las variables con IV inferior a 0,02; las de IV superior a 0,50 se marcaron para revisión, porque un poder predictivo tan alto suele indicar fuga de información más que señal legítima.</w:t>
+        <w:t>Se descartaron las variables con IV inferior a 0,02; las de IV igual o superior a 0,50 se marcaron para revisión, porque un poder predictivo tan alto suele indicar fuga de información más que señal legítima.</w:t>
       </w:r>
     </w:p>
     <w:p>
@@ -1621,7 +1621,7 @@
     </w:p>
     <w:p>
       <w:r>
-        <w:t>La PD se calibró por desplazamiento del intercepto (intercept offset), ajustando sobre la partición de Desarrollo contra la tasa de incumplimiento observada en Desarrollo, con una PD objetivo de 23,33 %. El ancla es a través del ciclo (TTC).</w:t>
+        <w:t>La PD se calibró por desplazamiento del intercepto (intercept offset), ajustando sobre la partición de Desarrollo contra la tasa de incumplimiento observada en Desarrollo, que resultó ser 23,33 %. El ancla es a través del ciclo (TTC).</w:t>
       </w:r>
     </w:p>
     <w:p>
@@ -9948,7 +9948,7 @@
     </w:p>
     <w:p>
       <w:r>
-        <w:t>La tabla de desempeño reparte la población en 10 tramos de riesgo ordenados por score, y permite verificar que la tasa de incumplimiento observada sea monótona entre tramos.</w:t>
+        <w:t>La tabla de desempeño usa hasta 10 tramos de riesgo configurados, ordenados por la PD calibrada. Los tramos efectivos por partición fueron Desarrollo: 10, Holdout: 10 y Fuera de tiempo (OOT): 10, y permiten verificar la evolución de la tasa de incumplimiento observada entre tramos.</w:t>
       </w:r>
     </w:p>
     <w:p>
@@ -17009,12 +17009,12 @@
     </w:p>
     <w:p>
       <w:r>
-        <w:t>El PSI del score en Desarrollo vs. Holdout es 0,0132 (banda «Estable»). La distribución del score se mantiene, de modo que no hay evidencia de desplazamiento poblacional.</w:t>
+        <w:t>El peor PSI entre score y PD en Desarrollo vs. Holdout es 0,0132 (banda «Estable»); corresponde a la PD calibrada. La distribución de la magnitud ganadora se mantiene, de modo que no hay desplazamiento poblacional.</w:t>
       </w:r>
     </w:p>
     <w:p>
       <w:r>
-        <w:t>El PSI del score en Desarrollo vs. OOT es 0,0068 (banda «Estable»). La distribución del score se mantiene, de modo que no hay evidencia de desplazamiento poblacional.</w:t>
+        <w:t>El peor PSI entre score y PD en Desarrollo vs. OOT es 0,0068 (banda «Estable»); corresponde al score. La distribución de la magnitud ganadora se mantiene, de modo que no hay desplazamiento poblacional.</w:t>
       </w:r>
     </w:p>
     <w:p>
@@ -17024,7 +17024,7 @@
     </w:p>
     <w:p>
       <w:r>
-        <w:t>El PSI se calculó sobre 10 tramos del score, definidos en Desarrollo.</w:t>
+        <w:t>Se configuraron hasta 10 tramos por magnitud para el PSI, definidos en Desarrollo.</w:t>
       </w:r>
     </w:p>
     <w:p>
@@ -32696,7 +32696,7 @@
     </w:p>
     <w:p>
       <w:r>
-        <w:t>Estabilidad (PSI del score): Desarrollo vs. Holdout 0,0132 («Estable») y Desarrollo vs. OOT 0,0068 («Estable»).</w:t>
+        <w:t>Estabilidad (peor PSI entre score y PD): Desarrollo vs. Holdout 0,0132 («Estable»; PD calibrada) y Desarrollo vs. OOT 0,0068 («Estable»; score).</w:t>
       </w:r>
     </w:p>
     <w:p>
@@ -32815,7 +32815,7 @@
         <w:rPr>
           <w:rFonts w:ascii="Consolas" w:hAnsi="Consolas"/>
         </w:rPr>
-        <w:t>2026-08-03T00:05:02.231202Z</w:t>
+        <w:t>2026-08-09T18:45:47.344618Z</w:t>
       </w:r>
     </w:p>
     <w:p>
@@ -32879,7 +32879,7 @@
         <w:rPr>
           <w:rFonts w:ascii="Consolas" w:hAnsi="Consolas"/>
         </w:rPr>
-        <w:t>d2f2b87116f07917191b396533c2da855ba8ff6c</w:t>
+        <w:t>6f1936374b2e6e6fe33e3d4a9ed1c5aea2a0e9bc</w:t>
       </w:r>
     </w:p>
     <w:p>
@@ -32899,7 +32899,7 @@
         <w:br/>
         <w:t xml:space="preserve">  "PyYAML": "6.0.3",</w:t>
         <w:br/>
-        <w:t xml:space="preserve">  "nikodym": "1.10.0",</w:t>
+        <w:t xml:space="preserve">  "nikodym": "1.11.0",</w:t>
         <w:br/>
         <w:t xml:space="preserve">  "numpy": "2.4.6",</w:t>
         <w:br/>
@@ -41720,6 +41720,28 @@
         <w:rPr>
           <w:b/>
         </w:rPr>
+        <w:t>psi_metric_by_comparison</w:t>
+      </w:r>
+    </w:p>
+    <w:p>
+      <w:r>
+        <w:rPr>
+          <w:rFonts w:ascii="Consolas" w:hAnsi="Consolas"/>
+        </w:rPr>
+        <w:t>{</w:t>
+        <w:br/>
+        <w:t xml:space="preserve">  "dev_vs_holdout": "pd_psi",</w:t>
+        <w:br/>
+        <w:t xml:space="preserve">  "dev_vs_oot": "score_psi"</w:t>
+        <w:br/>
+        <w:t>}</w:t>
+      </w:r>
+    </w:p>
+    <w:p>
+      <w:r>
+        <w:rPr>
+          <w:b/>
+        </w:rPr>
         <w:t>review_threshold</w:t>
       </w:r>
     </w:p>

</xml_diff>

<commit_message>
test: recaptura demo F1 factual
</commit_message>
<xml_diff>
--- a/web/src/fixtures/demo/report-f1.docx
+++ b/web/src/fixtures/demo/report-f1.docx
@@ -199,7 +199,7 @@
         <w:rPr>
           <w:rFonts w:ascii="Consolas" w:hAnsi="Consolas"/>
         </w:rPr>
-        <w:t>git_sha=6f1936374b2e6e6fe33e3d4a9ed1c5aea2a0e9bc</w:t>
+        <w:t>git_sha=8f8b7fd1291df0c3c509b77b84d84c72c37ba7a2</w:t>
       </w:r>
     </w:p>
     <w:p>
@@ -10645,7 +10645,7 @@
           <w:b/>
           <w:sz w:val="18"/>
         </w:rPr>
-        <w:t>Desempeño por decil de score</w:t>
+        <w:t>Desempeño por tramo de riesgo</w:t>
       </w:r>
     </w:p>
     <w:tbl>
@@ -32815,7 +32815,7 @@
         <w:rPr>
           <w:rFonts w:ascii="Consolas" w:hAnsi="Consolas"/>
         </w:rPr>
-        <w:t>2026-08-09T18:45:47.344618Z</w:t>
+        <w:t>2026-08-09T19:38:28.341722Z</w:t>
       </w:r>
     </w:p>
     <w:p>
@@ -32879,7 +32879,7 @@
         <w:rPr>
           <w:rFonts w:ascii="Consolas" w:hAnsi="Consolas"/>
         </w:rPr>
-        <w:t>6f1936374b2e6e6fe33e3d4a9ed1c5aea2a0e9bc</w:t>
+        <w:t>8f8b7fd1291df0c3c509b77b84d84c72c37ba7a2</w:t>
       </w:r>
     </w:p>
     <w:p>

</xml_diff>